<commit_message>
Update FairBanks evaluation documents for Community Cardiology Camp
- Enhanced `build_cardiology_camp_questionnaires.py` to include new contact information and branding updates.
- Improved layout and design of evaluation forms in both PDF and Word formats for consultants and internal staff, ensuring clarity and ease of use.
- Added a new function to finalize fillable PDFs, ensuring fields remain typeable and visible across different viewers.
- Updated content in evaluation documents to reflect accurate contact details and instructions for submission, reinforcing FairBanks' commitment to community engagement.
</commit_message>
<xml_diff>
--- a/questionnaires/consultant_sho_evaluation.docx
+++ b/questionnaires/consultant_sho_evaluation.docx
@@ -4,16 +4,42 @@
   <w:body>
     <w:p>
       <w:pPr>
+        <w:spacing w:after="80"/>
         <w:jc w:val="center"/>
       </w:pPr>
       <w:r>
-        <w:rPr>
-          <w:rFonts w:ascii="Calibri" w:hAnsi="Calibri"/>
-          <w:b/>
-          <w:color w:val="0B6E6B"/>
-          <w:sz w:val="32"/>
-        </w:rPr>
-        <w:t>FAIRBANKS MEDICAL CENTRE</w:t>
+        <w:drawing>
+          <wp:inline xmlns:a="http://schemas.openxmlformats.org/drawingml/2006/main" xmlns:pic="http://schemas.openxmlformats.org/drawingml/2006/picture">
+            <wp:extent cx="2286000" cy="858312"/>
+            <wp:docPr id="1" name="Picture 1"/>
+            <wp:cNvGraphicFramePr>
+              <a:graphicFrameLocks noChangeAspect="1"/>
+            </wp:cNvGraphicFramePr>
+            <a:graphic>
+              <a:graphicData uri="http://schemas.openxmlformats.org/drawingml/2006/picture">
+                <pic:pic>
+                  <pic:nvPicPr>
+                    <pic:cNvPr id="0" name="fairbanks_logo.jpeg"/>
+                    <pic:cNvPicPr/>
+                  </pic:nvPicPr>
+                  <pic:blipFill>
+                    <a:blip r:embed="rId9"/>
+                    <a:stretch>
+                      <a:fillRect/>
+                    </a:stretch>
+                  </pic:blipFill>
+                  <pic:spPr>
+                    <a:xfrm>
+                      <a:off x="0" y="0"/>
+                      <a:ext cx="2286000" cy="858312"/>
+                    </a:xfrm>
+                    <a:prstGeom prst="rect"/>
+                  </pic:spPr>
+                </pic:pic>
+              </a:graphicData>
+            </a:graphic>
+          </wp:inline>
+        </w:drawing>
       </w:r>
     </w:p>
     <w:p>
@@ -38,7 +64,7 @@
         <w:rPr>
           <w:rFonts w:ascii="Calibri" w:hAnsi="Calibri"/>
           <w:b/>
-          <w:color w:val="084E4C"/>
+          <w:color w:val="006B35"/>
           <w:sz w:val="24"/>
         </w:rPr>
         <w:t>Consultant &amp; Senior House Officer (SHO) Post-Camp Evaluation</w:t>
@@ -66,12 +92,58 @@
         <w:rPr>
           <w:rFonts w:ascii="Calibri" w:hAnsi="Calibri"/>
           <w:b w:val="0"/>
-          <w:color w:val="0B6E6B"/>
+          <w:color w:val="008C45"/>
           <w:sz w:val="18"/>
         </w:rPr>
         <w:t>Your health, our mission.</w:t>
       </w:r>
     </w:p>
+    <w:p>
+      <w:pPr>
+        <w:spacing w:after="0" w:before="0"/>
+        <w:jc w:val="center"/>
+      </w:pPr>
+      <w:r>
+        <w:rPr>
+          <w:rFonts w:ascii="Calibri" w:hAnsi="Calibri"/>
+          <w:b w:val="0"/>
+          <w:color w:val="5A6A6A"/>
+          <w:sz w:val="17"/>
+        </w:rPr>
+        <w:t>Tirupati Road, Kyebando-Kisalosalo (Opp. Northern Bypass Roundabout), Kampala</w:t>
+      </w:r>
+    </w:p>
+    <w:p>
+      <w:pPr>
+        <w:spacing w:after="0" w:before="0"/>
+        <w:jc w:val="center"/>
+      </w:pPr>
+      <w:r>
+        <w:rPr>
+          <w:rFonts w:ascii="Calibri" w:hAnsi="Calibri"/>
+          <w:b w:val="0"/>
+          <w:color w:val="5A6A6A"/>
+          <w:sz w:val="17"/>
+        </w:rPr>
+        <w:t>Tel: 0701 849258  |  WhatsApp: 0777 462398</w:t>
+      </w:r>
+    </w:p>
+    <w:p>
+      <w:pPr>
+        <w:spacing w:after="0" w:before="0"/>
+        <w:jc w:val="center"/>
+      </w:pPr>
+      <w:r>
+        <w:rPr>
+          <w:rFonts w:ascii="Calibri" w:hAnsi="Calibri"/>
+          <w:b w:val="0"/>
+          <w:color w:val="5A6A6A"/>
+          <w:sz w:val="17"/>
+        </w:rPr>
+        <w:t>Email: info@fairbanksmedicalcentre.org  |  Web: www.fairbanksmedicalcentre.ug</w:t>
+      </w:r>
+    </w:p>
+    <w:p/>
     <w:p>
       <w:pPr>
         <w:spacing w:after="80" w:before="0"/>
@@ -140,7 +212,7 @@
         <w:rPr>
           <w:rFonts w:ascii="Calibri" w:hAnsi="Calibri"/>
           <w:b/>
-          <w:color w:val="0B6E6B"/>
+          <w:color w:val="008C45"/>
           <w:sz w:val="23"/>
         </w:rPr>
         <w:t>SECTION A: General information</w:t>
@@ -346,7 +418,7 @@
         <w:rPr>
           <w:rFonts w:ascii="Calibri" w:hAnsi="Calibri"/>
           <w:b/>
-          <w:color w:val="0B6E6B"/>
+          <w:color w:val="008C45"/>
           <w:sz w:val="23"/>
         </w:rPr>
         <w:t>SECTION B: Overall rating</w:t>
@@ -386,7 +458,7 @@
         <w:tc>
           <w:tcPr>
             <w:tcW w:type="dxa" w:w="1700"/>
-            <w:shd w:fill="0B6E6B" w:val="clear"/>
+            <w:shd w:fill="008C45" w:val="clear"/>
           </w:tcPr>
           <w:p>
             <w:pPr>
@@ -407,7 +479,7 @@
         <w:tc>
           <w:tcPr>
             <w:tcW w:type="dxa" w:w="1700"/>
-            <w:shd w:fill="0B6E6B" w:val="clear"/>
+            <w:shd w:fill="008C45" w:val="clear"/>
           </w:tcPr>
           <w:p>
             <w:pPr>
@@ -430,7 +502,7 @@
         <w:tc>
           <w:tcPr>
             <w:tcW w:type="dxa" w:w="1700"/>
-            <w:shd w:fill="0B6E6B" w:val="clear"/>
+            <w:shd w:fill="008C45" w:val="clear"/>
           </w:tcPr>
           <w:p>
             <w:pPr>
@@ -453,7 +525,7 @@
         <w:tc>
           <w:tcPr>
             <w:tcW w:type="dxa" w:w="1700"/>
-            <w:shd w:fill="0B6E6B" w:val="clear"/>
+            <w:shd w:fill="008C45" w:val="clear"/>
           </w:tcPr>
           <w:p>
             <w:pPr>
@@ -476,7 +548,7 @@
         <w:tc>
           <w:tcPr>
             <w:tcW w:type="dxa" w:w="1700"/>
-            <w:shd w:fill="0B6E6B" w:val="clear"/>
+            <w:shd w:fill="008C45" w:val="clear"/>
           </w:tcPr>
           <w:p>
             <w:pPr>
@@ -499,7 +571,7 @@
         <w:tc>
           <w:tcPr>
             <w:tcW w:type="dxa" w:w="1700"/>
-            <w:shd w:fill="0B6E6B" w:val="clear"/>
+            <w:shd w:fill="008C45" w:val="clear"/>
           </w:tcPr>
           <w:p>
             <w:pPr>
@@ -637,7 +709,7 @@
         <w:tc>
           <w:tcPr>
             <w:tcW w:type="dxa" w:w="1700"/>
-            <w:shd w:fill="E8F5F4" w:val="clear"/>
+            <w:shd w:fill="E8F6EE" w:val="clear"/>
           </w:tcPr>
           <w:p>
             <w:r/>
@@ -654,7 +726,7 @@
         <w:tc>
           <w:tcPr>
             <w:tcW w:type="dxa" w:w="1700"/>
-            <w:shd w:fill="E8F5F4" w:val="clear"/>
+            <w:shd w:fill="E8F6EE" w:val="clear"/>
           </w:tcPr>
           <w:p>
             <w:pPr>
@@ -674,7 +746,7 @@
         <w:tc>
           <w:tcPr>
             <w:tcW w:type="dxa" w:w="1700"/>
-            <w:shd w:fill="E8F5F4" w:val="clear"/>
+            <w:shd w:fill="E8F6EE" w:val="clear"/>
           </w:tcPr>
           <w:p>
             <w:pPr>
@@ -694,7 +766,7 @@
         <w:tc>
           <w:tcPr>
             <w:tcW w:type="dxa" w:w="1700"/>
-            <w:shd w:fill="E8F5F4" w:val="clear"/>
+            <w:shd w:fill="E8F6EE" w:val="clear"/>
           </w:tcPr>
           <w:p>
             <w:pPr>
@@ -714,7 +786,7 @@
         <w:tc>
           <w:tcPr>
             <w:tcW w:type="dxa" w:w="1700"/>
-            <w:shd w:fill="E8F5F4" w:val="clear"/>
+            <w:shd w:fill="E8F6EE" w:val="clear"/>
           </w:tcPr>
           <w:p>
             <w:pPr>
@@ -734,7 +806,7 @@
         <w:tc>
           <w:tcPr>
             <w:tcW w:type="dxa" w:w="1700"/>
-            <w:shd w:fill="E8F5F4" w:val="clear"/>
+            <w:shd w:fill="E8F6EE" w:val="clear"/>
           </w:tcPr>
           <w:p>
             <w:pPr>
@@ -869,7 +941,7 @@
         <w:tc>
           <w:tcPr>
             <w:tcW w:type="dxa" w:w="1700"/>
-            <w:shd w:fill="E8F5F4" w:val="clear"/>
+            <w:shd w:fill="E8F6EE" w:val="clear"/>
           </w:tcPr>
           <w:p>
             <w:r/>
@@ -886,7 +958,7 @@
         <w:tc>
           <w:tcPr>
             <w:tcW w:type="dxa" w:w="1700"/>
-            <w:shd w:fill="E8F5F4" w:val="clear"/>
+            <w:shd w:fill="E8F6EE" w:val="clear"/>
           </w:tcPr>
           <w:p>
             <w:pPr>
@@ -906,7 +978,7 @@
         <w:tc>
           <w:tcPr>
             <w:tcW w:type="dxa" w:w="1700"/>
-            <w:shd w:fill="E8F5F4" w:val="clear"/>
+            <w:shd w:fill="E8F6EE" w:val="clear"/>
           </w:tcPr>
           <w:p>
             <w:pPr>
@@ -926,7 +998,7 @@
         <w:tc>
           <w:tcPr>
             <w:tcW w:type="dxa" w:w="1700"/>
-            <w:shd w:fill="E8F5F4" w:val="clear"/>
+            <w:shd w:fill="E8F6EE" w:val="clear"/>
           </w:tcPr>
           <w:p>
             <w:pPr>
@@ -946,7 +1018,7 @@
         <w:tc>
           <w:tcPr>
             <w:tcW w:type="dxa" w:w="1700"/>
-            <w:shd w:fill="E8F5F4" w:val="clear"/>
+            <w:shd w:fill="E8F6EE" w:val="clear"/>
           </w:tcPr>
           <w:p>
             <w:pPr>
@@ -966,7 +1038,7 @@
         <w:tc>
           <w:tcPr>
             <w:tcW w:type="dxa" w:w="1700"/>
-            <w:shd w:fill="E8F5F4" w:val="clear"/>
+            <w:shd w:fill="E8F6EE" w:val="clear"/>
           </w:tcPr>
           <w:p>
             <w:pPr>
@@ -1101,7 +1173,7 @@
         <w:tc>
           <w:tcPr>
             <w:tcW w:type="dxa" w:w="1700"/>
-            <w:shd w:fill="E8F5F4" w:val="clear"/>
+            <w:shd w:fill="E8F6EE" w:val="clear"/>
           </w:tcPr>
           <w:p>
             <w:r/>
@@ -1118,7 +1190,7 @@
         <w:tc>
           <w:tcPr>
             <w:tcW w:type="dxa" w:w="1700"/>
-            <w:shd w:fill="E8F5F4" w:val="clear"/>
+            <w:shd w:fill="E8F6EE" w:val="clear"/>
           </w:tcPr>
           <w:p>
             <w:pPr>
@@ -1138,7 +1210,7 @@
         <w:tc>
           <w:tcPr>
             <w:tcW w:type="dxa" w:w="1700"/>
-            <w:shd w:fill="E8F5F4" w:val="clear"/>
+            <w:shd w:fill="E8F6EE" w:val="clear"/>
           </w:tcPr>
           <w:p>
             <w:pPr>
@@ -1158,7 +1230,7 @@
         <w:tc>
           <w:tcPr>
             <w:tcW w:type="dxa" w:w="1700"/>
-            <w:shd w:fill="E8F5F4" w:val="clear"/>
+            <w:shd w:fill="E8F6EE" w:val="clear"/>
           </w:tcPr>
           <w:p>
             <w:pPr>
@@ -1178,7 +1250,7 @@
         <w:tc>
           <w:tcPr>
             <w:tcW w:type="dxa" w:w="1700"/>
-            <w:shd w:fill="E8F5F4" w:val="clear"/>
+            <w:shd w:fill="E8F6EE" w:val="clear"/>
           </w:tcPr>
           <w:p>
             <w:pPr>
@@ -1198,7 +1270,7 @@
         <w:tc>
           <w:tcPr>
             <w:tcW w:type="dxa" w:w="1700"/>
-            <w:shd w:fill="E8F5F4" w:val="clear"/>
+            <w:shd w:fill="E8F6EE" w:val="clear"/>
           </w:tcPr>
           <w:p>
             <w:pPr>
@@ -1333,7 +1405,7 @@
         <w:tc>
           <w:tcPr>
             <w:tcW w:type="dxa" w:w="1700"/>
-            <w:shd w:fill="E8F5F4" w:val="clear"/>
+            <w:shd w:fill="E8F6EE" w:val="clear"/>
           </w:tcPr>
           <w:p>
             <w:r/>
@@ -1350,7 +1422,7 @@
         <w:tc>
           <w:tcPr>
             <w:tcW w:type="dxa" w:w="1700"/>
-            <w:shd w:fill="E8F5F4" w:val="clear"/>
+            <w:shd w:fill="E8F6EE" w:val="clear"/>
           </w:tcPr>
           <w:p>
             <w:pPr>
@@ -1370,7 +1442,7 @@
         <w:tc>
           <w:tcPr>
             <w:tcW w:type="dxa" w:w="1700"/>
-            <w:shd w:fill="E8F5F4" w:val="clear"/>
+            <w:shd w:fill="E8F6EE" w:val="clear"/>
           </w:tcPr>
           <w:p>
             <w:pPr>
@@ -1390,7 +1462,7 @@
         <w:tc>
           <w:tcPr>
             <w:tcW w:type="dxa" w:w="1700"/>
-            <w:shd w:fill="E8F5F4" w:val="clear"/>
+            <w:shd w:fill="E8F6EE" w:val="clear"/>
           </w:tcPr>
           <w:p>
             <w:pPr>
@@ -1410,7 +1482,7 @@
         <w:tc>
           <w:tcPr>
             <w:tcW w:type="dxa" w:w="1700"/>
-            <w:shd w:fill="E8F5F4" w:val="clear"/>
+            <w:shd w:fill="E8F6EE" w:val="clear"/>
           </w:tcPr>
           <w:p>
             <w:pPr>
@@ -1430,7 +1502,7 @@
         <w:tc>
           <w:tcPr>
             <w:tcW w:type="dxa" w:w="1700"/>
-            <w:shd w:fill="E8F5F4" w:val="clear"/>
+            <w:shd w:fill="E8F6EE" w:val="clear"/>
           </w:tcPr>
           <w:p>
             <w:pPr>
@@ -1565,7 +1637,7 @@
         <w:tc>
           <w:tcPr>
             <w:tcW w:type="dxa" w:w="1700"/>
-            <w:shd w:fill="E8F5F4" w:val="clear"/>
+            <w:shd w:fill="E8F6EE" w:val="clear"/>
           </w:tcPr>
           <w:p>
             <w:r/>
@@ -1582,7 +1654,7 @@
         <w:tc>
           <w:tcPr>
             <w:tcW w:type="dxa" w:w="1700"/>
-            <w:shd w:fill="E8F5F4" w:val="clear"/>
+            <w:shd w:fill="E8F6EE" w:val="clear"/>
           </w:tcPr>
           <w:p>
             <w:pPr>
@@ -1602,7 +1674,7 @@
         <w:tc>
           <w:tcPr>
             <w:tcW w:type="dxa" w:w="1700"/>
-            <w:shd w:fill="E8F5F4" w:val="clear"/>
+            <w:shd w:fill="E8F6EE" w:val="clear"/>
           </w:tcPr>
           <w:p>
             <w:pPr>
@@ -1622,7 +1694,7 @@
         <w:tc>
           <w:tcPr>
             <w:tcW w:type="dxa" w:w="1700"/>
-            <w:shd w:fill="E8F5F4" w:val="clear"/>
+            <w:shd w:fill="E8F6EE" w:val="clear"/>
           </w:tcPr>
           <w:p>
             <w:pPr>
@@ -1642,7 +1714,7 @@
         <w:tc>
           <w:tcPr>
             <w:tcW w:type="dxa" w:w="1700"/>
-            <w:shd w:fill="E8F5F4" w:val="clear"/>
+            <w:shd w:fill="E8F6EE" w:val="clear"/>
           </w:tcPr>
           <w:p>
             <w:pPr>
@@ -1662,7 +1734,7 @@
         <w:tc>
           <w:tcPr>
             <w:tcW w:type="dxa" w:w="1700"/>
-            <w:shd w:fill="E8F5F4" w:val="clear"/>
+            <w:shd w:fill="E8F6EE" w:val="clear"/>
           </w:tcPr>
           <w:p>
             <w:pPr>
@@ -1803,7 +1875,7 @@
         <w:rPr>
           <w:rFonts w:ascii="Calibri" w:hAnsi="Calibri"/>
           <w:b/>
-          <w:color w:val="0B6E6B"/>
+          <w:color w:val="008C45"/>
           <w:sz w:val="23"/>
         </w:rPr>
         <w:t>SECTION C: Professional feedback</w:t>
@@ -2102,7 +2174,7 @@
         <w:rPr>
           <w:rFonts w:ascii="Calibri" w:hAnsi="Calibri"/>
           <w:b/>
-          <w:color w:val="0B6E6B"/>
+          <w:color w:val="008C45"/>
           <w:sz w:val="23"/>
         </w:rPr>
         <w:t>SECTION D: Patient follow-up and referral</w:t>
@@ -2371,7 +2443,7 @@
         <w:rPr>
           <w:rFonts w:ascii="Calibri" w:hAnsi="Calibri"/>
           <w:b/>
-          <w:color w:val="0B6E6B"/>
+          <w:color w:val="008C45"/>
           <w:sz w:val="23"/>
         </w:rPr>
         <w:t>SECTION E: Programme sustainability</w:t>
@@ -2602,7 +2674,7 @@
         <w:rPr>
           <w:rFonts w:ascii="Calibri" w:hAnsi="Calibri"/>
           <w:b/>
-          <w:color w:val="0B6E6B"/>
+          <w:color w:val="008C45"/>
           <w:sz w:val="23"/>
         </w:rPr>
         <w:t>SECTION F: Future collaboration</w:t>
@@ -2765,7 +2837,7 @@
         <w:rPr>
           <w:rFonts w:ascii="Calibri" w:hAnsi="Calibri"/>
           <w:b/>
-          <w:color w:val="0B6E6B"/>
+          <w:color w:val="008C45"/>
           <w:sz w:val="23"/>
         </w:rPr>
         <w:t>SECTION G: Closing remarks</w:t>
@@ -2854,7 +2926,7 @@
         <w:rPr>
           <w:rFonts w:ascii="Calibri" w:hAnsi="Calibri"/>
           <w:b/>
-          <w:color w:val="0B6E6B"/>
+          <w:color w:val="008C45"/>
           <w:sz w:val="23"/>
         </w:rPr>
         <w:t>SUBMISSION: How to return this form</w:t>
@@ -2872,19 +2944,79 @@
           <w:color w:val="1C2B2A"/>
           <w:sz w:val="20"/>
         </w:rPr>
-        <w:t>Please email your completed questionnaire to info@fairbanksmedicalcentre.org. You may type responses in this Word file, or print, fill by hand, and scan. Your feedback is confidential and used only for programme improvement, reporting, and partnership development.</w:t>
+        <w:t>Please email your completed questionnaire to info@fairbanksmedicalcentre.org. You may type responses in this Word file, or print, fill by hand, and scan. A fillable PDF is also available: type in the fields, save a filled copy, and email it back. Your feedback is confidential and used only for programme improvement, reporting, and partnership development.</w:t>
       </w:r>
     </w:p>
     <w:p>
       <w:pPr>
-        <w:spacing w:before="280"/>
+        <w:spacing w:after="40" w:before="0"/>
+        <w:jc w:val="left"/>
+      </w:pPr>
+      <w:r>
+        <w:rPr>
+          <w:rFonts w:ascii="Calibri" w:hAnsi="Calibri"/>
+          <w:b/>
+          <w:color w:val="1C2B2A"/>
+          <w:sz w:val="21"/>
+        </w:rPr>
+        <w:t>Contact FairBanks Medical Centre</w:t>
+      </w:r>
+    </w:p>
+    <w:p>
+      <w:pPr>
+        <w:spacing w:after="20" w:before="0"/>
+        <w:jc w:val="left"/>
+      </w:pPr>
+      <w:r>
+        <w:rPr>
+          <w:rFonts w:ascii="Calibri" w:hAnsi="Calibri"/>
+          <w:b w:val="0"/>
+          <w:color w:val="5A6A6A"/>
+          <w:sz w:val="19"/>
+        </w:rPr>
+        <w:t>Tirupati Road, Kyebando-Kisalosalo (Opp. Northern Bypass Roundabout), Kampala</w:t>
+      </w:r>
+    </w:p>
+    <w:p>
+      <w:pPr>
+        <w:spacing w:after="20" w:before="0"/>
+        <w:jc w:val="left"/>
+      </w:pPr>
+      <w:r>
+        <w:rPr>
+          <w:rFonts w:ascii="Calibri" w:hAnsi="Calibri"/>
+          <w:b w:val="0"/>
+          <w:color w:val="5A6A6A"/>
+          <w:sz w:val="19"/>
+        </w:rPr>
+        <w:t>Tel: 0701 849258  |  WhatsApp: 0777 462398</w:t>
+      </w:r>
+    </w:p>
+    <w:p>
+      <w:pPr>
+        <w:spacing w:after="120" w:before="0"/>
+        <w:jc w:val="left"/>
+      </w:pPr>
+      <w:r>
+        <w:rPr>
+          <w:rFonts w:ascii="Calibri" w:hAnsi="Calibri"/>
+          <w:b w:val="0"/>
+          <w:color w:val="5A6A6A"/>
+          <w:sz w:val="19"/>
+        </w:rPr>
+        <w:t>Email: info@fairbanksmedicalcentre.org  |  Web: www.fairbanksmedicalcentre.ug</w:t>
+      </w:r>
+    </w:p>
+    <w:p>
+      <w:pPr>
+        <w:spacing w:before="200"/>
         <w:jc w:val="center"/>
       </w:pPr>
       <w:r>
         <w:rPr>
           <w:rFonts w:ascii="Calibri" w:hAnsi="Calibri"/>
           <w:b/>
-          <w:color w:val="0B6E6B"/>
+          <w:color w:val="008C45"/>
           <w:sz w:val="20"/>
         </w:rPr>
         <w:t>Thank you for strengthening community cardiovascular care with FairBanks.</w:t>

</xml_diff>

<commit_message>
Enhance evaluation documents for FairBanks Community Cardiology Camp
- Updated `build_cardiology_camp_questionnaires.py` to improve layout and functionality, including new date fields and radio options for responses.
- Revised PDF and Word evaluation forms to ensure clarity and consistency in data collection, including formatting adjustments for better usability.
- Added date fields to capture completion dates in both consultant and internal staff evaluations, enhancing the documentation process.
- Improved overall design and instructions in evaluation documents to align with FairBanks' commitment to community engagement and feedback collection.
</commit_message>
<xml_diff>
--- a/questionnaires/consultant_sho_evaluation.docx
+++ b/questionnaires/consultant_sho_evaluation.docx
@@ -264,7 +264,7 @@
     </w:p>
     <w:p>
       <w:pPr>
-        <w:spacing w:after="80"/>
+        <w:spacing w:after="40"/>
       </w:pPr>
       <w:r>
         <w:rPr>
@@ -272,16 +272,140 @@
           <w:b/>
           <w:sz w:val="21"/>
         </w:rPr>
-        <w:t xml:space="preserve">Camp date(s): </w:t>
+        <w:t>Camp date:</w:t>
       </w:r>
+    </w:p>
+    <w:tbl>
+      <w:tblPr>
+        <w:tblW w:type="auto" w:w="0"/>
+        <w:tblLayout w:type="autofit"/>
+        <w:tblLook w:firstColumn="1" w:firstRow="1" w:lastColumn="0" w:lastRow="0" w:noHBand="0" w:noVBand="1" w:val="04A0"/>
+      </w:tblPr>
+      <w:tblGrid>
+        <w:gridCol w:w="2040"/>
+        <w:gridCol w:w="2040"/>
+        <w:gridCol w:w="2040"/>
+        <w:gridCol w:w="2040"/>
+        <w:gridCol w:w="2040"/>
+      </w:tblGrid>
+      <w:tr>
+        <w:tc>
+          <w:tcPr>
+            <w:tcW w:type="dxa" w:w="2040"/>
+            <w:shd w:fill="F7FBFF" w:val="clear"/>
+          </w:tcPr>
+          <w:p>
+            <w:pPr>
+              <w:jc w:val="center"/>
+            </w:pPr>
+            <w:r/>
+            <w:r>
+              <w:rPr>
+                <w:rFonts w:ascii="Calibri" w:hAnsi="Calibri"/>
+                <w:b w:val="0"/>
+                <w:color w:val="5A6A6A"/>
+                <w:sz w:val="22"/>
+              </w:rPr>
+              <w:t xml:space="preserve">  DD  </w:t>
+            </w:r>
+          </w:p>
+        </w:tc>
+        <w:tc>
+          <w:tcPr>
+            <w:tcW w:type="dxa" w:w="2040"/>
+          </w:tcPr>
+          <w:p>
+            <w:pPr>
+              <w:jc w:val="center"/>
+            </w:pPr>
+            <w:r/>
+            <w:r>
+              <w:rPr>
+                <w:rFonts w:ascii="Calibri" w:hAnsi="Calibri"/>
+                <w:b/>
+                <w:color w:val="008C45"/>
+                <w:sz w:val="28"/>
+              </w:rPr>
+              <w:t>/</w:t>
+            </w:r>
+          </w:p>
+        </w:tc>
+        <w:tc>
+          <w:tcPr>
+            <w:tcW w:type="dxa" w:w="2040"/>
+            <w:shd w:fill="F7FBFF" w:val="clear"/>
+          </w:tcPr>
+          <w:p>
+            <w:pPr>
+              <w:jc w:val="center"/>
+            </w:pPr>
+            <w:r/>
+            <w:r>
+              <w:rPr>
+                <w:rFonts w:ascii="Calibri" w:hAnsi="Calibri"/>
+                <w:b w:val="0"/>
+                <w:color w:val="5A6A6A"/>
+                <w:sz w:val="22"/>
+              </w:rPr>
+              <w:t xml:space="preserve">  MM  </w:t>
+            </w:r>
+          </w:p>
+        </w:tc>
+        <w:tc>
+          <w:tcPr>
+            <w:tcW w:type="dxa" w:w="2040"/>
+          </w:tcPr>
+          <w:p>
+            <w:pPr>
+              <w:jc w:val="center"/>
+            </w:pPr>
+            <w:r/>
+            <w:r>
+              <w:rPr>
+                <w:rFonts w:ascii="Calibri" w:hAnsi="Calibri"/>
+                <w:b/>
+                <w:color w:val="008C45"/>
+                <w:sz w:val="28"/>
+              </w:rPr>
+              <w:t>/</w:t>
+            </w:r>
+          </w:p>
+        </w:tc>
+        <w:tc>
+          <w:tcPr>
+            <w:tcW w:type="dxa" w:w="2040"/>
+            <w:shd w:fill="F7FBFF" w:val="clear"/>
+          </w:tcPr>
+          <w:p>
+            <w:pPr>
+              <w:jc w:val="center"/>
+            </w:pPr>
+            <w:r/>
+            <w:r>
+              <w:rPr>
+                <w:rFonts w:ascii="Calibri" w:hAnsi="Calibri"/>
+                <w:b w:val="0"/>
+                <w:color w:val="5A6A6A"/>
+                <w:sz w:val="22"/>
+              </w:rPr>
+              <w:t xml:space="preserve">  YYYY  </w:t>
+            </w:r>
+          </w:p>
+        </w:tc>
+      </w:tr>
+    </w:tbl>
+    <w:p>
+      <w:pPr>
+        <w:spacing w:after="160"/>
+      </w:pPr>
       <w:r>
         <w:rPr>
           <w:rFonts w:ascii="Calibri" w:hAnsi="Calibri"/>
           <w:b w:val="0"/>
           <w:color w:val="5A6A6A"/>
-          <w:sz w:val="21"/>
+          <w:sz w:val="17"/>
         </w:rPr>
-        <w:t>____________________________</w:t>
+        <w:t>Format: day / month / year  (example: 18 / 07 / 2026)</w:t>
       </w:r>
     </w:p>
     <w:p>
@@ -321,51 +445,225 @@
         <w:t>Designation (tick one):</w:t>
       </w:r>
     </w:p>
-    <w:p>
-      <w:pPr>
-        <w:spacing w:after="60" w:before="0"/>
-        <w:jc w:val="left"/>
-      </w:pPr>
-      <w:r>
-        <w:rPr>
-          <w:rFonts w:ascii="Calibri" w:hAnsi="Calibri"/>
-          <w:b w:val="0"/>
-          <w:color w:val="1C2B2A"/>
-          <w:sz w:val="20"/>
-        </w:rPr>
-        <w:t>☐  Consultant Physician     ☐  Cardiologist</w:t>
-      </w:r>
-    </w:p>
-    <w:p>
-      <w:pPr>
-        <w:spacing w:after="60" w:before="0"/>
-        <w:jc w:val="left"/>
-      </w:pPr>
-      <w:r>
-        <w:rPr>
-          <w:rFonts w:ascii="Calibri" w:hAnsi="Calibri"/>
-          <w:b w:val="0"/>
-          <w:color w:val="1C2B2A"/>
-          <w:sz w:val="20"/>
-        </w:rPr>
-        <w:t>☐  Senior House Officer (SHO)     ☐  Medical Officer</w:t>
-      </w:r>
-    </w:p>
-    <w:p>
-      <w:pPr>
-        <w:spacing w:after="60" w:before="0"/>
-        <w:jc w:val="left"/>
-      </w:pPr>
-      <w:r>
-        <w:rPr>
-          <w:rFonts w:ascii="Calibri" w:hAnsi="Calibri"/>
-          <w:b w:val="0"/>
-          <w:color w:val="1C2B2A"/>
-          <w:sz w:val="20"/>
-        </w:rPr>
-        <w:t>☐  Other</w:t>
-      </w:r>
-    </w:p>
+    <w:tbl>
+      <w:tblPr>
+        <w:tblW w:type="auto" w:w="0"/>
+        <w:tblLayout w:type="autofit"/>
+        <w:tblLook w:firstColumn="1" w:firstRow="1" w:lastColumn="0" w:lastRow="0" w:noHBand="0" w:noVBand="1" w:val="04A0"/>
+      </w:tblPr>
+      <w:tblGrid>
+        <w:gridCol w:w="5100"/>
+        <w:gridCol w:w="5100"/>
+      </w:tblGrid>
+      <w:tr>
+        <w:tc>
+          <w:tcPr>
+            <w:tcW w:type="dxa" w:w="5100"/>
+            <w:shd w:fill="F3FBF6" w:val="clear"/>
+          </w:tcPr>
+          <w:p>
+            <w:pPr>
+              <w:spacing w:after="40" w:before="40"/>
+            </w:pPr>
+            <w:r/>
+            <w:r>
+              <w:rPr>
+                <w:rFonts w:ascii="Calibri" w:hAnsi="Calibri"/>
+                <w:b w:val="0"/>
+                <w:color w:val="008C45"/>
+                <w:sz w:val="28"/>
+              </w:rPr>
+              <w:t>☐</w:t>
+            </w:r>
+            <w:r>
+              <w:rPr>
+                <w:rFonts w:ascii="Calibri" w:hAnsi="Calibri"/>
+                <w:b w:val="0"/>
+                <w:sz w:val="22"/>
+              </w:rPr>
+              <w:t xml:space="preserve">  </w:t>
+            </w:r>
+            <w:r>
+              <w:rPr>
+                <w:rFonts w:ascii="Calibri" w:hAnsi="Calibri"/>
+                <w:b w:val="0"/>
+                <w:color w:val="1C2B2A"/>
+                <w:sz w:val="21"/>
+              </w:rPr>
+              <w:t>Consultant Physician</w:t>
+            </w:r>
+          </w:p>
+        </w:tc>
+        <w:tc>
+          <w:tcPr>
+            <w:tcW w:type="dxa" w:w="5100"/>
+            <w:shd w:fill="F3FBF6" w:val="clear"/>
+          </w:tcPr>
+          <w:p>
+            <w:pPr>
+              <w:spacing w:after="40" w:before="40"/>
+            </w:pPr>
+            <w:r/>
+            <w:r>
+              <w:rPr>
+                <w:rFonts w:ascii="Calibri" w:hAnsi="Calibri"/>
+                <w:b w:val="0"/>
+                <w:color w:val="008C45"/>
+                <w:sz w:val="28"/>
+              </w:rPr>
+              <w:t>☐</w:t>
+            </w:r>
+            <w:r>
+              <w:rPr>
+                <w:rFonts w:ascii="Calibri" w:hAnsi="Calibri"/>
+                <w:b w:val="0"/>
+                <w:sz w:val="22"/>
+              </w:rPr>
+              <w:t xml:space="preserve">  </w:t>
+            </w:r>
+            <w:r>
+              <w:rPr>
+                <w:rFonts w:ascii="Calibri" w:hAnsi="Calibri"/>
+                <w:b w:val="0"/>
+                <w:color w:val="1C2B2A"/>
+                <w:sz w:val="21"/>
+              </w:rPr>
+              <w:t>Cardiologist</w:t>
+            </w:r>
+          </w:p>
+        </w:tc>
+      </w:tr>
+      <w:tr>
+        <w:tc>
+          <w:tcPr>
+            <w:tcW w:type="dxa" w:w="5100"/>
+            <w:shd w:fill="F3FBF6" w:val="clear"/>
+          </w:tcPr>
+          <w:p>
+            <w:pPr>
+              <w:spacing w:after="40" w:before="40"/>
+            </w:pPr>
+            <w:r/>
+            <w:r>
+              <w:rPr>
+                <w:rFonts w:ascii="Calibri" w:hAnsi="Calibri"/>
+                <w:b w:val="0"/>
+                <w:color w:val="008C45"/>
+                <w:sz w:val="28"/>
+              </w:rPr>
+              <w:t>☐</w:t>
+            </w:r>
+            <w:r>
+              <w:rPr>
+                <w:rFonts w:ascii="Calibri" w:hAnsi="Calibri"/>
+                <w:b w:val="0"/>
+                <w:sz w:val="22"/>
+              </w:rPr>
+              <w:t xml:space="preserve">  </w:t>
+            </w:r>
+            <w:r>
+              <w:rPr>
+                <w:rFonts w:ascii="Calibri" w:hAnsi="Calibri"/>
+                <w:b w:val="0"/>
+                <w:color w:val="1C2B2A"/>
+                <w:sz w:val="21"/>
+              </w:rPr>
+              <w:t>Senior House Officer (SHO)</w:t>
+            </w:r>
+          </w:p>
+        </w:tc>
+        <w:tc>
+          <w:tcPr>
+            <w:tcW w:type="dxa" w:w="5100"/>
+            <w:shd w:fill="F3FBF6" w:val="clear"/>
+          </w:tcPr>
+          <w:p>
+            <w:pPr>
+              <w:spacing w:after="40" w:before="40"/>
+            </w:pPr>
+            <w:r/>
+            <w:r>
+              <w:rPr>
+                <w:rFonts w:ascii="Calibri" w:hAnsi="Calibri"/>
+                <w:b w:val="0"/>
+                <w:color w:val="008C45"/>
+                <w:sz w:val="28"/>
+              </w:rPr>
+              <w:t>☐</w:t>
+            </w:r>
+            <w:r>
+              <w:rPr>
+                <w:rFonts w:ascii="Calibri" w:hAnsi="Calibri"/>
+                <w:b w:val="0"/>
+                <w:sz w:val="22"/>
+              </w:rPr>
+              <w:t xml:space="preserve">  </w:t>
+            </w:r>
+            <w:r>
+              <w:rPr>
+                <w:rFonts w:ascii="Calibri" w:hAnsi="Calibri"/>
+                <w:b w:val="0"/>
+                <w:color w:val="1C2B2A"/>
+                <w:sz w:val="21"/>
+              </w:rPr>
+              <w:t>Medical Officer</w:t>
+            </w:r>
+          </w:p>
+        </w:tc>
+      </w:tr>
+      <w:tr>
+        <w:tc>
+          <w:tcPr>
+            <w:tcW w:type="dxa" w:w="5100"/>
+            <w:shd w:fill="F3FBF6" w:val="clear"/>
+          </w:tcPr>
+          <w:p>
+            <w:pPr>
+              <w:spacing w:after="40" w:before="40"/>
+            </w:pPr>
+            <w:r/>
+            <w:r>
+              <w:rPr>
+                <w:rFonts w:ascii="Calibri" w:hAnsi="Calibri"/>
+                <w:b w:val="0"/>
+                <w:color w:val="008C45"/>
+                <w:sz w:val="28"/>
+              </w:rPr>
+              <w:t>☐</w:t>
+            </w:r>
+            <w:r>
+              <w:rPr>
+                <w:rFonts w:ascii="Calibri" w:hAnsi="Calibri"/>
+                <w:b w:val="0"/>
+                <w:sz w:val="22"/>
+              </w:rPr>
+              <w:t xml:space="preserve">  </w:t>
+            </w:r>
+            <w:r>
+              <w:rPr>
+                <w:rFonts w:ascii="Calibri" w:hAnsi="Calibri"/>
+                <w:b w:val="0"/>
+                <w:color w:val="1C2B2A"/>
+                <w:sz w:val="21"/>
+              </w:rPr>
+              <w:t>Other</w:t>
+            </w:r>
+          </w:p>
+        </w:tc>
+        <w:tc>
+          <w:tcPr>
+            <w:tcW w:type="dxa" w:w="5100"/>
+          </w:tcPr>
+          <w:p>
+            <w:pPr>
+              <w:spacing w:after="40" w:before="40"/>
+            </w:pPr>
+            <w:r/>
+          </w:p>
+        </w:tc>
+      </w:tr>
+    </w:tbl>
+    <w:p/>
     <w:p>
       <w:pPr>
         <w:spacing w:after="80"/>
@@ -408,6 +706,152 @@
           <w:sz w:val="21"/>
         </w:rPr>
         <w:t>____________________</w:t>
+      </w:r>
+    </w:p>
+    <w:p>
+      <w:pPr>
+        <w:spacing w:after="40"/>
+      </w:pPr>
+      <w:r>
+        <w:rPr>
+          <w:rFonts w:ascii="Calibri" w:hAnsi="Calibri"/>
+          <w:b/>
+          <w:sz w:val="21"/>
+        </w:rPr>
+        <w:t>Date you completed this form:</w:t>
+      </w:r>
+    </w:p>
+    <w:tbl>
+      <w:tblPr>
+        <w:tblW w:type="auto" w:w="0"/>
+        <w:tblLayout w:type="autofit"/>
+        <w:tblLook w:firstColumn="1" w:firstRow="1" w:lastColumn="0" w:lastRow="0" w:noHBand="0" w:noVBand="1" w:val="04A0"/>
+      </w:tblPr>
+      <w:tblGrid>
+        <w:gridCol w:w="2040"/>
+        <w:gridCol w:w="2040"/>
+        <w:gridCol w:w="2040"/>
+        <w:gridCol w:w="2040"/>
+        <w:gridCol w:w="2040"/>
+      </w:tblGrid>
+      <w:tr>
+        <w:tc>
+          <w:tcPr>
+            <w:tcW w:type="dxa" w:w="2040"/>
+            <w:shd w:fill="F7FBFF" w:val="clear"/>
+          </w:tcPr>
+          <w:p>
+            <w:pPr>
+              <w:jc w:val="center"/>
+            </w:pPr>
+            <w:r/>
+            <w:r>
+              <w:rPr>
+                <w:rFonts w:ascii="Calibri" w:hAnsi="Calibri"/>
+                <w:b w:val="0"/>
+                <w:color w:val="5A6A6A"/>
+                <w:sz w:val="22"/>
+              </w:rPr>
+              <w:t xml:space="preserve">  DD  </w:t>
+            </w:r>
+          </w:p>
+        </w:tc>
+        <w:tc>
+          <w:tcPr>
+            <w:tcW w:type="dxa" w:w="2040"/>
+          </w:tcPr>
+          <w:p>
+            <w:pPr>
+              <w:jc w:val="center"/>
+            </w:pPr>
+            <w:r/>
+            <w:r>
+              <w:rPr>
+                <w:rFonts w:ascii="Calibri" w:hAnsi="Calibri"/>
+                <w:b/>
+                <w:color w:val="008C45"/>
+                <w:sz w:val="28"/>
+              </w:rPr>
+              <w:t>/</w:t>
+            </w:r>
+          </w:p>
+        </w:tc>
+        <w:tc>
+          <w:tcPr>
+            <w:tcW w:type="dxa" w:w="2040"/>
+            <w:shd w:fill="F7FBFF" w:val="clear"/>
+          </w:tcPr>
+          <w:p>
+            <w:pPr>
+              <w:jc w:val="center"/>
+            </w:pPr>
+            <w:r/>
+            <w:r>
+              <w:rPr>
+                <w:rFonts w:ascii="Calibri" w:hAnsi="Calibri"/>
+                <w:b w:val="0"/>
+                <w:color w:val="5A6A6A"/>
+                <w:sz w:val="22"/>
+              </w:rPr>
+              <w:t xml:space="preserve">  MM  </w:t>
+            </w:r>
+          </w:p>
+        </w:tc>
+        <w:tc>
+          <w:tcPr>
+            <w:tcW w:type="dxa" w:w="2040"/>
+          </w:tcPr>
+          <w:p>
+            <w:pPr>
+              <w:jc w:val="center"/>
+            </w:pPr>
+            <w:r/>
+            <w:r>
+              <w:rPr>
+                <w:rFonts w:ascii="Calibri" w:hAnsi="Calibri"/>
+                <w:b/>
+                <w:color w:val="008C45"/>
+                <w:sz w:val="28"/>
+              </w:rPr>
+              <w:t>/</w:t>
+            </w:r>
+          </w:p>
+        </w:tc>
+        <w:tc>
+          <w:tcPr>
+            <w:tcW w:type="dxa" w:w="2040"/>
+            <w:shd w:fill="F7FBFF" w:val="clear"/>
+          </w:tcPr>
+          <w:p>
+            <w:pPr>
+              <w:jc w:val="center"/>
+            </w:pPr>
+            <w:r/>
+            <w:r>
+              <w:rPr>
+                <w:rFonts w:ascii="Calibri" w:hAnsi="Calibri"/>
+                <w:b w:val="0"/>
+                <w:color w:val="5A6A6A"/>
+                <w:sz w:val="22"/>
+              </w:rPr>
+              <w:t xml:space="preserve">  YYYY  </w:t>
+            </w:r>
+          </w:p>
+        </w:tc>
+      </w:tr>
+    </w:tbl>
+    <w:p>
+      <w:pPr>
+        <w:spacing w:after="160"/>
+      </w:pPr>
+      <w:r>
+        <w:rPr>
+          <w:rFonts w:ascii="Calibri" w:hAnsi="Calibri"/>
+          <w:b w:val="0"/>
+          <w:color w:val="5A6A6A"/>
+          <w:sz w:val="17"/>
+        </w:rPr>
+        <w:t>Format: day / month / year  (example: 18 / 07 / 2026)</w:t>
       </w:r>
     </w:p>
     <w:p>
@@ -622,7 +1066,8 @@
               <w:rPr>
                 <w:rFonts w:ascii="Calibri" w:hAnsi="Calibri"/>
                 <w:b w:val="0"/>
-                <w:sz w:val="22"/>
+                <w:color w:val="008C45"/>
+                <w:sz w:val="28"/>
               </w:rPr>
               <w:t>☐</w:t>
             </w:r>
@@ -641,7 +1086,8 @@
               <w:rPr>
                 <w:rFonts w:ascii="Calibri" w:hAnsi="Calibri"/>
                 <w:b w:val="0"/>
-                <w:sz w:val="22"/>
+                <w:color w:val="008C45"/>
+                <w:sz w:val="28"/>
               </w:rPr>
               <w:t>☐</w:t>
             </w:r>
@@ -660,7 +1106,8 @@
               <w:rPr>
                 <w:rFonts w:ascii="Calibri" w:hAnsi="Calibri"/>
                 <w:b w:val="0"/>
-                <w:sz w:val="22"/>
+                <w:color w:val="008C45"/>
+                <w:sz w:val="28"/>
               </w:rPr>
               <w:t>☐</w:t>
             </w:r>
@@ -679,7 +1126,8 @@
               <w:rPr>
                 <w:rFonts w:ascii="Calibri" w:hAnsi="Calibri"/>
                 <w:b w:val="0"/>
-                <w:sz w:val="22"/>
+                <w:color w:val="008C45"/>
+                <w:sz w:val="28"/>
               </w:rPr>
               <w:t>☐</w:t>
             </w:r>
@@ -698,7 +1146,8 @@
               <w:rPr>
                 <w:rFonts w:ascii="Calibri" w:hAnsi="Calibri"/>
                 <w:b w:val="0"/>
-                <w:sz w:val="22"/>
+                <w:color w:val="008C45"/>
+                <w:sz w:val="28"/>
               </w:rPr>
               <w:t>☐</w:t>
             </w:r>
@@ -737,7 +1186,8 @@
               <w:rPr>
                 <w:rFonts w:ascii="Calibri" w:hAnsi="Calibri"/>
                 <w:b w:val="0"/>
-                <w:sz w:val="22"/>
+                <w:color w:val="008C45"/>
+                <w:sz w:val="28"/>
               </w:rPr>
               <w:t>☐</w:t>
             </w:r>
@@ -757,7 +1207,8 @@
               <w:rPr>
                 <w:rFonts w:ascii="Calibri" w:hAnsi="Calibri"/>
                 <w:b w:val="0"/>
-                <w:sz w:val="22"/>
+                <w:color w:val="008C45"/>
+                <w:sz w:val="28"/>
               </w:rPr>
               <w:t>☐</w:t>
             </w:r>
@@ -777,7 +1228,8 @@
               <w:rPr>
                 <w:rFonts w:ascii="Calibri" w:hAnsi="Calibri"/>
                 <w:b w:val="0"/>
-                <w:sz w:val="22"/>
+                <w:color w:val="008C45"/>
+                <w:sz w:val="28"/>
               </w:rPr>
               <w:t>☐</w:t>
             </w:r>
@@ -797,7 +1249,8 @@
               <w:rPr>
                 <w:rFonts w:ascii="Calibri" w:hAnsi="Calibri"/>
                 <w:b w:val="0"/>
-                <w:sz w:val="22"/>
+                <w:color w:val="008C45"/>
+                <w:sz w:val="28"/>
               </w:rPr>
               <w:t>☐</w:t>
             </w:r>
@@ -817,7 +1270,8 @@
               <w:rPr>
                 <w:rFonts w:ascii="Calibri" w:hAnsi="Calibri"/>
                 <w:b w:val="0"/>
-                <w:sz w:val="22"/>
+                <w:color w:val="008C45"/>
+                <w:sz w:val="28"/>
               </w:rPr>
               <w:t>☐</w:t>
             </w:r>
@@ -854,7 +1308,8 @@
               <w:rPr>
                 <w:rFonts w:ascii="Calibri" w:hAnsi="Calibri"/>
                 <w:b w:val="0"/>
-                <w:sz w:val="22"/>
+                <w:color w:val="008C45"/>
+                <w:sz w:val="28"/>
               </w:rPr>
               <w:t>☐</w:t>
             </w:r>
@@ -873,7 +1328,8 @@
               <w:rPr>
                 <w:rFonts w:ascii="Calibri" w:hAnsi="Calibri"/>
                 <w:b w:val="0"/>
-                <w:sz w:val="22"/>
+                <w:color w:val="008C45"/>
+                <w:sz w:val="28"/>
               </w:rPr>
               <w:t>☐</w:t>
             </w:r>
@@ -892,7 +1348,8 @@
               <w:rPr>
                 <w:rFonts w:ascii="Calibri" w:hAnsi="Calibri"/>
                 <w:b w:val="0"/>
-                <w:sz w:val="22"/>
+                <w:color w:val="008C45"/>
+                <w:sz w:val="28"/>
               </w:rPr>
               <w:t>☐</w:t>
             </w:r>
@@ -911,7 +1368,8 @@
               <w:rPr>
                 <w:rFonts w:ascii="Calibri" w:hAnsi="Calibri"/>
                 <w:b w:val="0"/>
-                <w:sz w:val="22"/>
+                <w:color w:val="008C45"/>
+                <w:sz w:val="28"/>
               </w:rPr>
               <w:t>☐</w:t>
             </w:r>
@@ -930,7 +1388,8 @@
               <w:rPr>
                 <w:rFonts w:ascii="Calibri" w:hAnsi="Calibri"/>
                 <w:b w:val="0"/>
-                <w:sz w:val="22"/>
+                <w:color w:val="008C45"/>
+                <w:sz w:val="28"/>
               </w:rPr>
               <w:t>☐</w:t>
             </w:r>
@@ -969,7 +1428,8 @@
               <w:rPr>
                 <w:rFonts w:ascii="Calibri" w:hAnsi="Calibri"/>
                 <w:b w:val="0"/>
-                <w:sz w:val="22"/>
+                <w:color w:val="008C45"/>
+                <w:sz w:val="28"/>
               </w:rPr>
               <w:t>☐</w:t>
             </w:r>
@@ -989,7 +1449,8 @@
               <w:rPr>
                 <w:rFonts w:ascii="Calibri" w:hAnsi="Calibri"/>
                 <w:b w:val="0"/>
-                <w:sz w:val="22"/>
+                <w:color w:val="008C45"/>
+                <w:sz w:val="28"/>
               </w:rPr>
               <w:t>☐</w:t>
             </w:r>
@@ -1009,7 +1470,8 @@
               <w:rPr>
                 <w:rFonts w:ascii="Calibri" w:hAnsi="Calibri"/>
                 <w:b w:val="0"/>
-                <w:sz w:val="22"/>
+                <w:color w:val="008C45"/>
+                <w:sz w:val="28"/>
               </w:rPr>
               <w:t>☐</w:t>
             </w:r>
@@ -1029,7 +1491,8 @@
               <w:rPr>
                 <w:rFonts w:ascii="Calibri" w:hAnsi="Calibri"/>
                 <w:b w:val="0"/>
-                <w:sz w:val="22"/>
+                <w:color w:val="008C45"/>
+                <w:sz w:val="28"/>
               </w:rPr>
               <w:t>☐</w:t>
             </w:r>
@@ -1049,7 +1512,8 @@
               <w:rPr>
                 <w:rFonts w:ascii="Calibri" w:hAnsi="Calibri"/>
                 <w:b w:val="0"/>
-                <w:sz w:val="22"/>
+                <w:color w:val="008C45"/>
+                <w:sz w:val="28"/>
               </w:rPr>
               <w:t>☐</w:t>
             </w:r>
@@ -1086,7 +1550,8 @@
               <w:rPr>
                 <w:rFonts w:ascii="Calibri" w:hAnsi="Calibri"/>
                 <w:b w:val="0"/>
-                <w:sz w:val="22"/>
+                <w:color w:val="008C45"/>
+                <w:sz w:val="28"/>
               </w:rPr>
               <w:t>☐</w:t>
             </w:r>
@@ -1105,7 +1570,8 @@
               <w:rPr>
                 <w:rFonts w:ascii="Calibri" w:hAnsi="Calibri"/>
                 <w:b w:val="0"/>
-                <w:sz w:val="22"/>
+                <w:color w:val="008C45"/>
+                <w:sz w:val="28"/>
               </w:rPr>
               <w:t>☐</w:t>
             </w:r>
@@ -1124,7 +1590,8 @@
               <w:rPr>
                 <w:rFonts w:ascii="Calibri" w:hAnsi="Calibri"/>
                 <w:b w:val="0"/>
-                <w:sz w:val="22"/>
+                <w:color w:val="008C45"/>
+                <w:sz w:val="28"/>
               </w:rPr>
               <w:t>☐</w:t>
             </w:r>
@@ -1143,7 +1610,8 @@
               <w:rPr>
                 <w:rFonts w:ascii="Calibri" w:hAnsi="Calibri"/>
                 <w:b w:val="0"/>
-                <w:sz w:val="22"/>
+                <w:color w:val="008C45"/>
+                <w:sz w:val="28"/>
               </w:rPr>
               <w:t>☐</w:t>
             </w:r>
@@ -1162,7 +1630,8 @@
               <w:rPr>
                 <w:rFonts w:ascii="Calibri" w:hAnsi="Calibri"/>
                 <w:b w:val="0"/>
-                <w:sz w:val="22"/>
+                <w:color w:val="008C45"/>
+                <w:sz w:val="28"/>
               </w:rPr>
               <w:t>☐</w:t>
             </w:r>
@@ -1201,7 +1670,8 @@
               <w:rPr>
                 <w:rFonts w:ascii="Calibri" w:hAnsi="Calibri"/>
                 <w:b w:val="0"/>
-                <w:sz w:val="22"/>
+                <w:color w:val="008C45"/>
+                <w:sz w:val="28"/>
               </w:rPr>
               <w:t>☐</w:t>
             </w:r>
@@ -1221,7 +1691,8 @@
               <w:rPr>
                 <w:rFonts w:ascii="Calibri" w:hAnsi="Calibri"/>
                 <w:b w:val="0"/>
-                <w:sz w:val="22"/>
+                <w:color w:val="008C45"/>
+                <w:sz w:val="28"/>
               </w:rPr>
               <w:t>☐</w:t>
             </w:r>
@@ -1241,7 +1712,8 @@
               <w:rPr>
                 <w:rFonts w:ascii="Calibri" w:hAnsi="Calibri"/>
                 <w:b w:val="0"/>
-                <w:sz w:val="22"/>
+                <w:color w:val="008C45"/>
+                <w:sz w:val="28"/>
               </w:rPr>
               <w:t>☐</w:t>
             </w:r>
@@ -1261,7 +1733,8 @@
               <w:rPr>
                 <w:rFonts w:ascii="Calibri" w:hAnsi="Calibri"/>
                 <w:b w:val="0"/>
-                <w:sz w:val="22"/>
+                <w:color w:val="008C45"/>
+                <w:sz w:val="28"/>
               </w:rPr>
               <w:t>☐</w:t>
             </w:r>
@@ -1281,7 +1754,8 @@
               <w:rPr>
                 <w:rFonts w:ascii="Calibri" w:hAnsi="Calibri"/>
                 <w:b w:val="0"/>
-                <w:sz w:val="22"/>
+                <w:color w:val="008C45"/>
+                <w:sz w:val="28"/>
               </w:rPr>
               <w:t>☐</w:t>
             </w:r>
@@ -1318,7 +1792,8 @@
               <w:rPr>
                 <w:rFonts w:ascii="Calibri" w:hAnsi="Calibri"/>
                 <w:b w:val="0"/>
-                <w:sz w:val="22"/>
+                <w:color w:val="008C45"/>
+                <w:sz w:val="28"/>
               </w:rPr>
               <w:t>☐</w:t>
             </w:r>
@@ -1337,7 +1812,8 @@
               <w:rPr>
                 <w:rFonts w:ascii="Calibri" w:hAnsi="Calibri"/>
                 <w:b w:val="0"/>
-                <w:sz w:val="22"/>
+                <w:color w:val="008C45"/>
+                <w:sz w:val="28"/>
               </w:rPr>
               <w:t>☐</w:t>
             </w:r>
@@ -1356,7 +1832,8 @@
               <w:rPr>
                 <w:rFonts w:ascii="Calibri" w:hAnsi="Calibri"/>
                 <w:b w:val="0"/>
-                <w:sz w:val="22"/>
+                <w:color w:val="008C45"/>
+                <w:sz w:val="28"/>
               </w:rPr>
               <w:t>☐</w:t>
             </w:r>
@@ -1375,7 +1852,8 @@
               <w:rPr>
                 <w:rFonts w:ascii="Calibri" w:hAnsi="Calibri"/>
                 <w:b w:val="0"/>
-                <w:sz w:val="22"/>
+                <w:color w:val="008C45"/>
+                <w:sz w:val="28"/>
               </w:rPr>
               <w:t>☐</w:t>
             </w:r>
@@ -1394,7 +1872,8 @@
               <w:rPr>
                 <w:rFonts w:ascii="Calibri" w:hAnsi="Calibri"/>
                 <w:b w:val="0"/>
-                <w:sz w:val="22"/>
+                <w:color w:val="008C45"/>
+                <w:sz w:val="28"/>
               </w:rPr>
               <w:t>☐</w:t>
             </w:r>
@@ -1433,7 +1912,8 @@
               <w:rPr>
                 <w:rFonts w:ascii="Calibri" w:hAnsi="Calibri"/>
                 <w:b w:val="0"/>
-                <w:sz w:val="22"/>
+                <w:color w:val="008C45"/>
+                <w:sz w:val="28"/>
               </w:rPr>
               <w:t>☐</w:t>
             </w:r>
@@ -1453,7 +1933,8 @@
               <w:rPr>
                 <w:rFonts w:ascii="Calibri" w:hAnsi="Calibri"/>
                 <w:b w:val="0"/>
-                <w:sz w:val="22"/>
+                <w:color w:val="008C45"/>
+                <w:sz w:val="28"/>
               </w:rPr>
               <w:t>☐</w:t>
             </w:r>
@@ -1473,7 +1954,8 @@
               <w:rPr>
                 <w:rFonts w:ascii="Calibri" w:hAnsi="Calibri"/>
                 <w:b w:val="0"/>
-                <w:sz w:val="22"/>
+                <w:color w:val="008C45"/>
+                <w:sz w:val="28"/>
               </w:rPr>
               <w:t>☐</w:t>
             </w:r>
@@ -1493,7 +1975,8 @@
               <w:rPr>
                 <w:rFonts w:ascii="Calibri" w:hAnsi="Calibri"/>
                 <w:b w:val="0"/>
-                <w:sz w:val="22"/>
+                <w:color w:val="008C45"/>
+                <w:sz w:val="28"/>
               </w:rPr>
               <w:t>☐</w:t>
             </w:r>
@@ -1513,7 +1996,8 @@
               <w:rPr>
                 <w:rFonts w:ascii="Calibri" w:hAnsi="Calibri"/>
                 <w:b w:val="0"/>
-                <w:sz w:val="22"/>
+                <w:color w:val="008C45"/>
+                <w:sz w:val="28"/>
               </w:rPr>
               <w:t>☐</w:t>
             </w:r>
@@ -1550,7 +2034,8 @@
               <w:rPr>
                 <w:rFonts w:ascii="Calibri" w:hAnsi="Calibri"/>
                 <w:b w:val="0"/>
-                <w:sz w:val="22"/>
+                <w:color w:val="008C45"/>
+                <w:sz w:val="28"/>
               </w:rPr>
               <w:t>☐</w:t>
             </w:r>
@@ -1569,7 +2054,8 @@
               <w:rPr>
                 <w:rFonts w:ascii="Calibri" w:hAnsi="Calibri"/>
                 <w:b w:val="0"/>
-                <w:sz w:val="22"/>
+                <w:color w:val="008C45"/>
+                <w:sz w:val="28"/>
               </w:rPr>
               <w:t>☐</w:t>
             </w:r>
@@ -1588,7 +2074,8 @@
               <w:rPr>
                 <w:rFonts w:ascii="Calibri" w:hAnsi="Calibri"/>
                 <w:b w:val="0"/>
-                <w:sz w:val="22"/>
+                <w:color w:val="008C45"/>
+                <w:sz w:val="28"/>
               </w:rPr>
               <w:t>☐</w:t>
             </w:r>
@@ -1607,7 +2094,8 @@
               <w:rPr>
                 <w:rFonts w:ascii="Calibri" w:hAnsi="Calibri"/>
                 <w:b w:val="0"/>
-                <w:sz w:val="22"/>
+                <w:color w:val="008C45"/>
+                <w:sz w:val="28"/>
               </w:rPr>
               <w:t>☐</w:t>
             </w:r>
@@ -1626,7 +2114,8 @@
               <w:rPr>
                 <w:rFonts w:ascii="Calibri" w:hAnsi="Calibri"/>
                 <w:b w:val="0"/>
-                <w:sz w:val="22"/>
+                <w:color w:val="008C45"/>
+                <w:sz w:val="28"/>
               </w:rPr>
               <w:t>☐</w:t>
             </w:r>
@@ -1665,7 +2154,8 @@
               <w:rPr>
                 <w:rFonts w:ascii="Calibri" w:hAnsi="Calibri"/>
                 <w:b w:val="0"/>
-                <w:sz w:val="22"/>
+                <w:color w:val="008C45"/>
+                <w:sz w:val="28"/>
               </w:rPr>
               <w:t>☐</w:t>
             </w:r>
@@ -1685,7 +2175,8 @@
               <w:rPr>
                 <w:rFonts w:ascii="Calibri" w:hAnsi="Calibri"/>
                 <w:b w:val="0"/>
-                <w:sz w:val="22"/>
+                <w:color w:val="008C45"/>
+                <w:sz w:val="28"/>
               </w:rPr>
               <w:t>☐</w:t>
             </w:r>
@@ -1705,7 +2196,8 @@
               <w:rPr>
                 <w:rFonts w:ascii="Calibri" w:hAnsi="Calibri"/>
                 <w:b w:val="0"/>
-                <w:sz w:val="22"/>
+                <w:color w:val="008C45"/>
+                <w:sz w:val="28"/>
               </w:rPr>
               <w:t>☐</w:t>
             </w:r>
@@ -1725,7 +2217,8 @@
               <w:rPr>
                 <w:rFonts w:ascii="Calibri" w:hAnsi="Calibri"/>
                 <w:b w:val="0"/>
-                <w:sz w:val="22"/>
+                <w:color w:val="008C45"/>
+                <w:sz w:val="28"/>
               </w:rPr>
               <w:t>☐</w:t>
             </w:r>
@@ -1745,7 +2238,8 @@
               <w:rPr>
                 <w:rFonts w:ascii="Calibri" w:hAnsi="Calibri"/>
                 <w:b w:val="0"/>
-                <w:sz w:val="22"/>
+                <w:color w:val="008C45"/>
+                <w:sz w:val="28"/>
               </w:rPr>
               <w:t>☐</w:t>
             </w:r>
@@ -1782,7 +2276,8 @@
               <w:rPr>
                 <w:rFonts w:ascii="Calibri" w:hAnsi="Calibri"/>
                 <w:b w:val="0"/>
-                <w:sz w:val="22"/>
+                <w:color w:val="008C45"/>
+                <w:sz w:val="28"/>
               </w:rPr>
               <w:t>☐</w:t>
             </w:r>
@@ -1801,7 +2296,8 @@
               <w:rPr>
                 <w:rFonts w:ascii="Calibri" w:hAnsi="Calibri"/>
                 <w:b w:val="0"/>
-                <w:sz w:val="22"/>
+                <w:color w:val="008C45"/>
+                <w:sz w:val="28"/>
               </w:rPr>
               <w:t>☐</w:t>
             </w:r>
@@ -1820,7 +2316,8 @@
               <w:rPr>
                 <w:rFonts w:ascii="Calibri" w:hAnsi="Calibri"/>
                 <w:b w:val="0"/>
-                <w:sz w:val="22"/>
+                <w:color w:val="008C45"/>
+                <w:sz w:val="28"/>
               </w:rPr>
               <w:t>☐</w:t>
             </w:r>
@@ -1839,7 +2336,8 @@
               <w:rPr>
                 <w:rFonts w:ascii="Calibri" w:hAnsi="Calibri"/>
                 <w:b w:val="0"/>
-                <w:sz w:val="22"/>
+                <w:color w:val="008C45"/>
+                <w:sz w:val="28"/>
               </w:rPr>
               <w:t>☐</w:t>
             </w:r>
@@ -1858,7 +2356,8 @@
               <w:rPr>
                 <w:rFonts w:ascii="Calibri" w:hAnsi="Calibri"/>
                 <w:b w:val="0"/>
-                <w:sz w:val="22"/>
+                <w:color w:val="008C45"/>
+                <w:sz w:val="28"/>
               </w:rPr>
               <w:t>☐</w:t>
             </w:r>
@@ -2524,66 +3023,456 @@
         <w:t>2. Which services should FairBanks prioritise in future community outreaches? (tick all that apply)</w:t>
       </w:r>
     </w:p>
-    <w:p>
-      <w:pPr>
-        <w:spacing w:after="60" w:before="0"/>
-        <w:jc w:val="left"/>
-      </w:pPr>
-      <w:r>
-        <w:rPr>
-          <w:rFonts w:ascii="Calibri" w:hAnsi="Calibri"/>
-          <w:b w:val="0"/>
-          <w:color w:val="1C2B2A"/>
-          <w:sz w:val="20"/>
-        </w:rPr>
-        <w:t>☐  Cardiology     ☐  Hypertension     ☐  Diabetes</w:t>
-      </w:r>
-    </w:p>
-    <w:p>
-      <w:pPr>
-        <w:spacing w:after="60" w:before="0"/>
-        <w:jc w:val="left"/>
-      </w:pPr>
-      <w:r>
-        <w:rPr>
-          <w:rFonts w:ascii="Calibri" w:hAnsi="Calibri"/>
-          <w:b w:val="0"/>
-          <w:color w:val="1C2B2A"/>
-          <w:sz w:val="20"/>
-        </w:rPr>
-        <w:t>☐  Women's Health     ☐  Men's Health     ☐  Children's Health</w:t>
-      </w:r>
-    </w:p>
-    <w:p>
-      <w:pPr>
-        <w:spacing w:after="60" w:before="0"/>
-        <w:jc w:val="left"/>
-      </w:pPr>
-      <w:r>
-        <w:rPr>
-          <w:rFonts w:ascii="Calibri" w:hAnsi="Calibri"/>
-          <w:b w:val="0"/>
-          <w:color w:val="1C2B2A"/>
-          <w:sz w:val="20"/>
-        </w:rPr>
-        <w:t>☐  Eye Care     ☐  Mental Health     ☐  Cancer Screening</w:t>
-      </w:r>
-    </w:p>
-    <w:p>
-      <w:pPr>
-        <w:spacing w:after="60" w:before="0"/>
-        <w:jc w:val="left"/>
-      </w:pPr>
-      <w:r>
-        <w:rPr>
-          <w:rFonts w:ascii="Calibri" w:hAnsi="Calibri"/>
-          <w:b w:val="0"/>
-          <w:color w:val="1C2B2A"/>
-          <w:sz w:val="20"/>
-        </w:rPr>
-        <w:t>☐  Elderly Care / Gericare     ☐  Other</w:t>
-      </w:r>
-    </w:p>
+    <w:tbl>
+      <w:tblPr>
+        <w:tblW w:type="auto" w:w="0"/>
+        <w:tblLayout w:type="autofit"/>
+        <w:tblLook w:firstColumn="1" w:firstRow="1" w:lastColumn="0" w:lastRow="0" w:noHBand="0" w:noVBand="1" w:val="04A0"/>
+      </w:tblPr>
+      <w:tblGrid>
+        <w:gridCol w:w="3400"/>
+        <w:gridCol w:w="3400"/>
+        <w:gridCol w:w="3400"/>
+      </w:tblGrid>
+      <w:tr>
+        <w:tc>
+          <w:tcPr>
+            <w:tcW w:type="dxa" w:w="3400"/>
+            <w:shd w:fill="F3FBF6" w:val="clear"/>
+          </w:tcPr>
+          <w:p>
+            <w:pPr>
+              <w:spacing w:after="40" w:before="40"/>
+            </w:pPr>
+            <w:r/>
+            <w:r>
+              <w:rPr>
+                <w:rFonts w:ascii="Calibri" w:hAnsi="Calibri"/>
+                <w:b w:val="0"/>
+                <w:color w:val="008C45"/>
+                <w:sz w:val="28"/>
+              </w:rPr>
+              <w:t>☐</w:t>
+            </w:r>
+            <w:r>
+              <w:rPr>
+                <w:rFonts w:ascii="Calibri" w:hAnsi="Calibri"/>
+                <w:b w:val="0"/>
+                <w:sz w:val="22"/>
+              </w:rPr>
+              <w:t xml:space="preserve">  </w:t>
+            </w:r>
+            <w:r>
+              <w:rPr>
+                <w:rFonts w:ascii="Calibri" w:hAnsi="Calibri"/>
+                <w:b w:val="0"/>
+                <w:color w:val="1C2B2A"/>
+                <w:sz w:val="21"/>
+              </w:rPr>
+              <w:t>Cardiology</w:t>
+            </w:r>
+          </w:p>
+        </w:tc>
+        <w:tc>
+          <w:tcPr>
+            <w:tcW w:type="dxa" w:w="3400"/>
+            <w:shd w:fill="F3FBF6" w:val="clear"/>
+          </w:tcPr>
+          <w:p>
+            <w:pPr>
+              <w:spacing w:after="40" w:before="40"/>
+            </w:pPr>
+            <w:r/>
+            <w:r>
+              <w:rPr>
+                <w:rFonts w:ascii="Calibri" w:hAnsi="Calibri"/>
+                <w:b w:val="0"/>
+                <w:color w:val="008C45"/>
+                <w:sz w:val="28"/>
+              </w:rPr>
+              <w:t>☐</w:t>
+            </w:r>
+            <w:r>
+              <w:rPr>
+                <w:rFonts w:ascii="Calibri" w:hAnsi="Calibri"/>
+                <w:b w:val="0"/>
+                <w:sz w:val="22"/>
+              </w:rPr>
+              <w:t xml:space="preserve">  </w:t>
+            </w:r>
+            <w:r>
+              <w:rPr>
+                <w:rFonts w:ascii="Calibri" w:hAnsi="Calibri"/>
+                <w:b w:val="0"/>
+                <w:color w:val="1C2B2A"/>
+                <w:sz w:val="21"/>
+              </w:rPr>
+              <w:t>Hypertension</w:t>
+            </w:r>
+          </w:p>
+        </w:tc>
+        <w:tc>
+          <w:tcPr>
+            <w:tcW w:type="dxa" w:w="3400"/>
+            <w:shd w:fill="F3FBF6" w:val="clear"/>
+          </w:tcPr>
+          <w:p>
+            <w:pPr>
+              <w:spacing w:after="40" w:before="40"/>
+            </w:pPr>
+            <w:r/>
+            <w:r>
+              <w:rPr>
+                <w:rFonts w:ascii="Calibri" w:hAnsi="Calibri"/>
+                <w:b w:val="0"/>
+                <w:color w:val="008C45"/>
+                <w:sz w:val="28"/>
+              </w:rPr>
+              <w:t>☐</w:t>
+            </w:r>
+            <w:r>
+              <w:rPr>
+                <w:rFonts w:ascii="Calibri" w:hAnsi="Calibri"/>
+                <w:b w:val="0"/>
+                <w:sz w:val="22"/>
+              </w:rPr>
+              <w:t xml:space="preserve">  </w:t>
+            </w:r>
+            <w:r>
+              <w:rPr>
+                <w:rFonts w:ascii="Calibri" w:hAnsi="Calibri"/>
+                <w:b w:val="0"/>
+                <w:color w:val="1C2B2A"/>
+                <w:sz w:val="21"/>
+              </w:rPr>
+              <w:t>Diabetes</w:t>
+            </w:r>
+          </w:p>
+        </w:tc>
+      </w:tr>
+      <w:tr>
+        <w:tc>
+          <w:tcPr>
+            <w:tcW w:type="dxa" w:w="3400"/>
+            <w:shd w:fill="F3FBF6" w:val="clear"/>
+          </w:tcPr>
+          <w:p>
+            <w:pPr>
+              <w:spacing w:after="40" w:before="40"/>
+            </w:pPr>
+            <w:r/>
+            <w:r>
+              <w:rPr>
+                <w:rFonts w:ascii="Calibri" w:hAnsi="Calibri"/>
+                <w:b w:val="0"/>
+                <w:color w:val="008C45"/>
+                <w:sz w:val="28"/>
+              </w:rPr>
+              <w:t>☐</w:t>
+            </w:r>
+            <w:r>
+              <w:rPr>
+                <w:rFonts w:ascii="Calibri" w:hAnsi="Calibri"/>
+                <w:b w:val="0"/>
+                <w:sz w:val="22"/>
+              </w:rPr>
+              <w:t xml:space="preserve">  </w:t>
+            </w:r>
+            <w:r>
+              <w:rPr>
+                <w:rFonts w:ascii="Calibri" w:hAnsi="Calibri"/>
+                <w:b w:val="0"/>
+                <w:color w:val="1C2B2A"/>
+                <w:sz w:val="21"/>
+              </w:rPr>
+              <w:t>Women's Health</w:t>
+            </w:r>
+          </w:p>
+        </w:tc>
+        <w:tc>
+          <w:tcPr>
+            <w:tcW w:type="dxa" w:w="3400"/>
+            <w:shd w:fill="F3FBF6" w:val="clear"/>
+          </w:tcPr>
+          <w:p>
+            <w:pPr>
+              <w:spacing w:after="40" w:before="40"/>
+            </w:pPr>
+            <w:r/>
+            <w:r>
+              <w:rPr>
+                <w:rFonts w:ascii="Calibri" w:hAnsi="Calibri"/>
+                <w:b w:val="0"/>
+                <w:color w:val="008C45"/>
+                <w:sz w:val="28"/>
+              </w:rPr>
+              <w:t>☐</w:t>
+            </w:r>
+            <w:r>
+              <w:rPr>
+                <w:rFonts w:ascii="Calibri" w:hAnsi="Calibri"/>
+                <w:b w:val="0"/>
+                <w:sz w:val="22"/>
+              </w:rPr>
+              <w:t xml:space="preserve">  </w:t>
+            </w:r>
+            <w:r>
+              <w:rPr>
+                <w:rFonts w:ascii="Calibri" w:hAnsi="Calibri"/>
+                <w:b w:val="0"/>
+                <w:color w:val="1C2B2A"/>
+                <w:sz w:val="21"/>
+              </w:rPr>
+              <w:t>Men's Health</w:t>
+            </w:r>
+          </w:p>
+        </w:tc>
+        <w:tc>
+          <w:tcPr>
+            <w:tcW w:type="dxa" w:w="3400"/>
+            <w:shd w:fill="F3FBF6" w:val="clear"/>
+          </w:tcPr>
+          <w:p>
+            <w:pPr>
+              <w:spacing w:after="40" w:before="40"/>
+            </w:pPr>
+            <w:r/>
+            <w:r>
+              <w:rPr>
+                <w:rFonts w:ascii="Calibri" w:hAnsi="Calibri"/>
+                <w:b w:val="0"/>
+                <w:color w:val="008C45"/>
+                <w:sz w:val="28"/>
+              </w:rPr>
+              <w:t>☐</w:t>
+            </w:r>
+            <w:r>
+              <w:rPr>
+                <w:rFonts w:ascii="Calibri" w:hAnsi="Calibri"/>
+                <w:b w:val="0"/>
+                <w:sz w:val="22"/>
+              </w:rPr>
+              <w:t xml:space="preserve">  </w:t>
+            </w:r>
+            <w:r>
+              <w:rPr>
+                <w:rFonts w:ascii="Calibri" w:hAnsi="Calibri"/>
+                <w:b w:val="0"/>
+                <w:color w:val="1C2B2A"/>
+                <w:sz w:val="21"/>
+              </w:rPr>
+              <w:t>Children's Health</w:t>
+            </w:r>
+          </w:p>
+        </w:tc>
+      </w:tr>
+      <w:tr>
+        <w:tc>
+          <w:tcPr>
+            <w:tcW w:type="dxa" w:w="3400"/>
+            <w:shd w:fill="F3FBF6" w:val="clear"/>
+          </w:tcPr>
+          <w:p>
+            <w:pPr>
+              <w:spacing w:after="40" w:before="40"/>
+            </w:pPr>
+            <w:r/>
+            <w:r>
+              <w:rPr>
+                <w:rFonts w:ascii="Calibri" w:hAnsi="Calibri"/>
+                <w:b w:val="0"/>
+                <w:color w:val="008C45"/>
+                <w:sz w:val="28"/>
+              </w:rPr>
+              <w:t>☐</w:t>
+            </w:r>
+            <w:r>
+              <w:rPr>
+                <w:rFonts w:ascii="Calibri" w:hAnsi="Calibri"/>
+                <w:b w:val="0"/>
+                <w:sz w:val="22"/>
+              </w:rPr>
+              <w:t xml:space="preserve">  </w:t>
+            </w:r>
+            <w:r>
+              <w:rPr>
+                <w:rFonts w:ascii="Calibri" w:hAnsi="Calibri"/>
+                <w:b w:val="0"/>
+                <w:color w:val="1C2B2A"/>
+                <w:sz w:val="21"/>
+              </w:rPr>
+              <w:t>Eye Care</w:t>
+            </w:r>
+          </w:p>
+        </w:tc>
+        <w:tc>
+          <w:tcPr>
+            <w:tcW w:type="dxa" w:w="3400"/>
+            <w:shd w:fill="F3FBF6" w:val="clear"/>
+          </w:tcPr>
+          <w:p>
+            <w:pPr>
+              <w:spacing w:after="40" w:before="40"/>
+            </w:pPr>
+            <w:r/>
+            <w:r>
+              <w:rPr>
+                <w:rFonts w:ascii="Calibri" w:hAnsi="Calibri"/>
+                <w:b w:val="0"/>
+                <w:color w:val="008C45"/>
+                <w:sz w:val="28"/>
+              </w:rPr>
+              <w:t>☐</w:t>
+            </w:r>
+            <w:r>
+              <w:rPr>
+                <w:rFonts w:ascii="Calibri" w:hAnsi="Calibri"/>
+                <w:b w:val="0"/>
+                <w:sz w:val="22"/>
+              </w:rPr>
+              <w:t xml:space="preserve">  </w:t>
+            </w:r>
+            <w:r>
+              <w:rPr>
+                <w:rFonts w:ascii="Calibri" w:hAnsi="Calibri"/>
+                <w:b w:val="0"/>
+                <w:color w:val="1C2B2A"/>
+                <w:sz w:val="21"/>
+              </w:rPr>
+              <w:t>Mental Health</w:t>
+            </w:r>
+          </w:p>
+        </w:tc>
+        <w:tc>
+          <w:tcPr>
+            <w:tcW w:type="dxa" w:w="3400"/>
+            <w:shd w:fill="F3FBF6" w:val="clear"/>
+          </w:tcPr>
+          <w:p>
+            <w:pPr>
+              <w:spacing w:after="40" w:before="40"/>
+            </w:pPr>
+            <w:r/>
+            <w:r>
+              <w:rPr>
+                <w:rFonts w:ascii="Calibri" w:hAnsi="Calibri"/>
+                <w:b w:val="0"/>
+                <w:color w:val="008C45"/>
+                <w:sz w:val="28"/>
+              </w:rPr>
+              <w:t>☐</w:t>
+            </w:r>
+            <w:r>
+              <w:rPr>
+                <w:rFonts w:ascii="Calibri" w:hAnsi="Calibri"/>
+                <w:b w:val="0"/>
+                <w:sz w:val="22"/>
+              </w:rPr>
+              <w:t xml:space="preserve">  </w:t>
+            </w:r>
+            <w:r>
+              <w:rPr>
+                <w:rFonts w:ascii="Calibri" w:hAnsi="Calibri"/>
+                <w:b w:val="0"/>
+                <w:color w:val="1C2B2A"/>
+                <w:sz w:val="21"/>
+              </w:rPr>
+              <w:t>Cancer Screening</w:t>
+            </w:r>
+          </w:p>
+        </w:tc>
+      </w:tr>
+      <w:tr>
+        <w:tc>
+          <w:tcPr>
+            <w:tcW w:type="dxa" w:w="3400"/>
+            <w:shd w:fill="F3FBF6" w:val="clear"/>
+          </w:tcPr>
+          <w:p>
+            <w:pPr>
+              <w:spacing w:after="40" w:before="40"/>
+            </w:pPr>
+            <w:r/>
+            <w:r>
+              <w:rPr>
+                <w:rFonts w:ascii="Calibri" w:hAnsi="Calibri"/>
+                <w:b w:val="0"/>
+                <w:color w:val="008C45"/>
+                <w:sz w:val="28"/>
+              </w:rPr>
+              <w:t>☐</w:t>
+            </w:r>
+            <w:r>
+              <w:rPr>
+                <w:rFonts w:ascii="Calibri" w:hAnsi="Calibri"/>
+                <w:b w:val="0"/>
+                <w:sz w:val="22"/>
+              </w:rPr>
+              <w:t xml:space="preserve">  </w:t>
+            </w:r>
+            <w:r>
+              <w:rPr>
+                <w:rFonts w:ascii="Calibri" w:hAnsi="Calibri"/>
+                <w:b w:val="0"/>
+                <w:color w:val="1C2B2A"/>
+                <w:sz w:val="21"/>
+              </w:rPr>
+              <w:t>Elderly Care / Gericare</w:t>
+            </w:r>
+          </w:p>
+        </w:tc>
+        <w:tc>
+          <w:tcPr>
+            <w:tcW w:type="dxa" w:w="3400"/>
+            <w:shd w:fill="F3FBF6" w:val="clear"/>
+          </w:tcPr>
+          <w:p>
+            <w:pPr>
+              <w:spacing w:after="40" w:before="40"/>
+            </w:pPr>
+            <w:r/>
+            <w:r>
+              <w:rPr>
+                <w:rFonts w:ascii="Calibri" w:hAnsi="Calibri"/>
+                <w:b w:val="0"/>
+                <w:color w:val="008C45"/>
+                <w:sz w:val="28"/>
+              </w:rPr>
+              <w:t>☐</w:t>
+            </w:r>
+            <w:r>
+              <w:rPr>
+                <w:rFonts w:ascii="Calibri" w:hAnsi="Calibri"/>
+                <w:b w:val="0"/>
+                <w:sz w:val="22"/>
+              </w:rPr>
+              <w:t xml:space="preserve">  </w:t>
+            </w:r>
+            <w:r>
+              <w:rPr>
+                <w:rFonts w:ascii="Calibri" w:hAnsi="Calibri"/>
+                <w:b w:val="0"/>
+                <w:color w:val="1C2B2A"/>
+                <w:sz w:val="21"/>
+              </w:rPr>
+              <w:t>Other</w:t>
+            </w:r>
+          </w:p>
+        </w:tc>
+        <w:tc>
+          <w:tcPr>
+            <w:tcW w:type="dxa" w:w="3400"/>
+          </w:tcPr>
+          <w:p>
+            <w:pPr>
+              <w:spacing w:after="40" w:before="40"/>
+            </w:pPr>
+            <w:r/>
+          </w:p>
+        </w:tc>
+      </w:tr>
+    </w:tbl>
+    <w:p/>
     <w:p>
       <w:pPr>
         <w:spacing w:after="80"/>
@@ -2695,21 +3584,135 @@
         <w:t>Would you be willing to join future FairBanks Reach Programmes?</w:t>
       </w:r>
     </w:p>
-    <w:p>
-      <w:pPr>
-        <w:spacing w:after="60" w:before="0"/>
-        <w:jc w:val="left"/>
-      </w:pPr>
-      <w:r>
-        <w:rPr>
-          <w:rFonts w:ascii="Calibri" w:hAnsi="Calibri"/>
-          <w:b w:val="0"/>
-          <w:color w:val="1C2B2A"/>
-          <w:sz w:val="20"/>
-        </w:rPr>
-        <w:t>☐  Yes     ☐  No     ☐  Maybe</w:t>
-      </w:r>
-    </w:p>
+    <w:tbl>
+      <w:tblPr>
+        <w:tblW w:type="auto" w:w="0"/>
+        <w:tblLayout w:type="autofit"/>
+        <w:tblLook w:firstColumn="1" w:firstRow="1" w:lastColumn="0" w:lastRow="0" w:noHBand="0" w:noVBand="1" w:val="04A0"/>
+      </w:tblPr>
+      <w:tblGrid>
+        <w:gridCol w:w="3400"/>
+        <w:gridCol w:w="3400"/>
+        <w:gridCol w:w="3400"/>
+      </w:tblGrid>
+      <w:tr>
+        <w:tc>
+          <w:tcPr>
+            <w:tcW w:type="dxa" w:w="3400"/>
+            <w:shd w:fill="F3FBF6" w:val="clear"/>
+          </w:tcPr>
+          <w:p>
+            <w:pPr>
+              <w:spacing w:after="40" w:before="40"/>
+            </w:pPr>
+            <w:r/>
+            <w:r>
+              <w:rPr>
+                <w:rFonts w:ascii="Calibri" w:hAnsi="Calibri"/>
+                <w:b w:val="0"/>
+                <w:color w:val="008C45"/>
+                <w:sz w:val="28"/>
+              </w:rPr>
+              <w:t>☐</w:t>
+            </w:r>
+            <w:r>
+              <w:rPr>
+                <w:rFonts w:ascii="Calibri" w:hAnsi="Calibri"/>
+                <w:b w:val="0"/>
+                <w:sz w:val="22"/>
+              </w:rPr>
+              <w:t xml:space="preserve">  </w:t>
+            </w:r>
+            <w:r>
+              <w:rPr>
+                <w:rFonts w:ascii="Calibri" w:hAnsi="Calibri"/>
+                <w:b/>
+                <w:color w:val="1C2B2A"/>
+                <w:sz w:val="21"/>
+              </w:rPr>
+              <w:t>Yes</w:t>
+            </w:r>
+          </w:p>
+        </w:tc>
+        <w:tc>
+          <w:tcPr>
+            <w:tcW w:type="dxa" w:w="3400"/>
+            <w:shd w:fill="F3FBF6" w:val="clear"/>
+          </w:tcPr>
+          <w:p>
+            <w:pPr>
+              <w:spacing w:after="40" w:before="40"/>
+            </w:pPr>
+            <w:r/>
+            <w:r>
+              <w:rPr>
+                <w:rFonts w:ascii="Calibri" w:hAnsi="Calibri"/>
+                <w:b w:val="0"/>
+                <w:color w:val="008C45"/>
+                <w:sz w:val="28"/>
+              </w:rPr>
+              <w:t>☐</w:t>
+            </w:r>
+            <w:r>
+              <w:rPr>
+                <w:rFonts w:ascii="Calibri" w:hAnsi="Calibri"/>
+                <w:b w:val="0"/>
+                <w:sz w:val="22"/>
+              </w:rPr>
+              <w:t xml:space="preserve">  </w:t>
+            </w:r>
+            <w:r>
+              <w:rPr>
+                <w:rFonts w:ascii="Calibri" w:hAnsi="Calibri"/>
+                <w:b/>
+                <w:color w:val="1C2B2A"/>
+                <w:sz w:val="21"/>
+              </w:rPr>
+              <w:t>No</w:t>
+            </w:r>
+          </w:p>
+        </w:tc>
+        <w:tc>
+          <w:tcPr>
+            <w:tcW w:type="dxa" w:w="3400"/>
+            <w:shd w:fill="F3FBF6" w:val="clear"/>
+          </w:tcPr>
+          <w:p>
+            <w:pPr>
+              <w:spacing w:after="40" w:before="40"/>
+            </w:pPr>
+            <w:r/>
+            <w:r>
+              <w:rPr>
+                <w:rFonts w:ascii="Calibri" w:hAnsi="Calibri"/>
+                <w:b w:val="0"/>
+                <w:color w:val="008C45"/>
+                <w:sz w:val="28"/>
+              </w:rPr>
+              <w:t>☐</w:t>
+            </w:r>
+            <w:r>
+              <w:rPr>
+                <w:rFonts w:ascii="Calibri" w:hAnsi="Calibri"/>
+                <w:b w:val="0"/>
+                <w:sz w:val="22"/>
+              </w:rPr>
+              <w:t xml:space="preserve">  </w:t>
+            </w:r>
+            <w:r>
+              <w:rPr>
+                <w:rFonts w:ascii="Calibri" w:hAnsi="Calibri"/>
+                <w:b/>
+                <w:color w:val="1C2B2A"/>
+                <w:sz w:val="21"/>
+              </w:rPr>
+              <w:t>Maybe</w:t>
+            </w:r>
+          </w:p>
+        </w:tc>
+      </w:tr>
+    </w:tbl>
+    <w:p/>
     <w:p>
       <w:pPr>
         <w:spacing w:after="60" w:before="0"/>
@@ -2725,66 +3728,303 @@
         <w:t>If yes or maybe, in what capacity? (tick all that apply)</w:t>
       </w:r>
     </w:p>
-    <w:p>
-      <w:pPr>
-        <w:spacing w:after="60" w:before="0"/>
-        <w:jc w:val="left"/>
-      </w:pPr>
-      <w:r>
-        <w:rPr>
-          <w:rFonts w:ascii="Calibri" w:hAnsi="Calibri"/>
-          <w:b w:val="0"/>
-          <w:color w:val="1C2B2A"/>
-          <w:sz w:val="20"/>
-        </w:rPr>
-        <w:t>☐  Clinical services     ☐  Training and mentorship</w:t>
-      </w:r>
-    </w:p>
-    <w:p>
-      <w:pPr>
-        <w:spacing w:after="60" w:before="0"/>
-        <w:jc w:val="left"/>
-      </w:pPr>
-      <w:r>
-        <w:rPr>
-          <w:rFonts w:ascii="Calibri" w:hAnsi="Calibri"/>
-          <w:b w:val="0"/>
-          <w:color w:val="1C2B2A"/>
-          <w:sz w:val="20"/>
-        </w:rPr>
-        <w:t>☐  Research     ☐  Community outreach</w:t>
-      </w:r>
-    </w:p>
-    <w:p>
-      <w:pPr>
-        <w:spacing w:after="60" w:before="0"/>
-        <w:jc w:val="left"/>
-      </w:pPr>
-      <w:r>
-        <w:rPr>
-          <w:rFonts w:ascii="Calibri" w:hAnsi="Calibri"/>
-          <w:b w:val="0"/>
-          <w:color w:val="1C2B2A"/>
-          <w:sz w:val="20"/>
-        </w:rPr>
-        <w:t>☐  Health education     ☐  Programme planning</w:t>
-      </w:r>
-    </w:p>
-    <w:p>
-      <w:pPr>
-        <w:spacing w:after="60" w:before="0"/>
-        <w:jc w:val="left"/>
-      </w:pPr>
-      <w:r>
-        <w:rPr>
-          <w:rFonts w:ascii="Calibri" w:hAnsi="Calibri"/>
-          <w:b w:val="0"/>
-          <w:color w:val="1C2B2A"/>
-          <w:sz w:val="20"/>
-        </w:rPr>
-        <w:t>☐  Other</w:t>
-      </w:r>
-    </w:p>
+    <w:tbl>
+      <w:tblPr>
+        <w:tblW w:type="auto" w:w="0"/>
+        <w:tblLayout w:type="autofit"/>
+        <w:tblLook w:firstColumn="1" w:firstRow="1" w:lastColumn="0" w:lastRow="0" w:noHBand="0" w:noVBand="1" w:val="04A0"/>
+      </w:tblPr>
+      <w:tblGrid>
+        <w:gridCol w:w="5100"/>
+        <w:gridCol w:w="5100"/>
+      </w:tblGrid>
+      <w:tr>
+        <w:tc>
+          <w:tcPr>
+            <w:tcW w:type="dxa" w:w="5100"/>
+            <w:shd w:fill="F3FBF6" w:val="clear"/>
+          </w:tcPr>
+          <w:p>
+            <w:pPr>
+              <w:spacing w:after="40" w:before="40"/>
+            </w:pPr>
+            <w:r/>
+            <w:r>
+              <w:rPr>
+                <w:rFonts w:ascii="Calibri" w:hAnsi="Calibri"/>
+                <w:b w:val="0"/>
+                <w:color w:val="008C45"/>
+                <w:sz w:val="28"/>
+              </w:rPr>
+              <w:t>☐</w:t>
+            </w:r>
+            <w:r>
+              <w:rPr>
+                <w:rFonts w:ascii="Calibri" w:hAnsi="Calibri"/>
+                <w:b w:val="0"/>
+                <w:sz w:val="22"/>
+              </w:rPr>
+              <w:t xml:space="preserve">  </w:t>
+            </w:r>
+            <w:r>
+              <w:rPr>
+                <w:rFonts w:ascii="Calibri" w:hAnsi="Calibri"/>
+                <w:b w:val="0"/>
+                <w:color w:val="1C2B2A"/>
+                <w:sz w:val="21"/>
+              </w:rPr>
+              <w:t>Clinical services</w:t>
+            </w:r>
+          </w:p>
+        </w:tc>
+        <w:tc>
+          <w:tcPr>
+            <w:tcW w:type="dxa" w:w="5100"/>
+            <w:shd w:fill="F3FBF6" w:val="clear"/>
+          </w:tcPr>
+          <w:p>
+            <w:pPr>
+              <w:spacing w:after="40" w:before="40"/>
+            </w:pPr>
+            <w:r/>
+            <w:r>
+              <w:rPr>
+                <w:rFonts w:ascii="Calibri" w:hAnsi="Calibri"/>
+                <w:b w:val="0"/>
+                <w:color w:val="008C45"/>
+                <w:sz w:val="28"/>
+              </w:rPr>
+              <w:t>☐</w:t>
+            </w:r>
+            <w:r>
+              <w:rPr>
+                <w:rFonts w:ascii="Calibri" w:hAnsi="Calibri"/>
+                <w:b w:val="0"/>
+                <w:sz w:val="22"/>
+              </w:rPr>
+              <w:t xml:space="preserve">  </w:t>
+            </w:r>
+            <w:r>
+              <w:rPr>
+                <w:rFonts w:ascii="Calibri" w:hAnsi="Calibri"/>
+                <w:b w:val="0"/>
+                <w:color w:val="1C2B2A"/>
+                <w:sz w:val="21"/>
+              </w:rPr>
+              <w:t>Training and mentorship</w:t>
+            </w:r>
+          </w:p>
+        </w:tc>
+      </w:tr>
+      <w:tr>
+        <w:tc>
+          <w:tcPr>
+            <w:tcW w:type="dxa" w:w="5100"/>
+            <w:shd w:fill="F3FBF6" w:val="clear"/>
+          </w:tcPr>
+          <w:p>
+            <w:pPr>
+              <w:spacing w:after="40" w:before="40"/>
+            </w:pPr>
+            <w:r/>
+            <w:r>
+              <w:rPr>
+                <w:rFonts w:ascii="Calibri" w:hAnsi="Calibri"/>
+                <w:b w:val="0"/>
+                <w:color w:val="008C45"/>
+                <w:sz w:val="28"/>
+              </w:rPr>
+              <w:t>☐</w:t>
+            </w:r>
+            <w:r>
+              <w:rPr>
+                <w:rFonts w:ascii="Calibri" w:hAnsi="Calibri"/>
+                <w:b w:val="0"/>
+                <w:sz w:val="22"/>
+              </w:rPr>
+              <w:t xml:space="preserve">  </w:t>
+            </w:r>
+            <w:r>
+              <w:rPr>
+                <w:rFonts w:ascii="Calibri" w:hAnsi="Calibri"/>
+                <w:b w:val="0"/>
+                <w:color w:val="1C2B2A"/>
+                <w:sz w:val="21"/>
+              </w:rPr>
+              <w:t>Research</w:t>
+            </w:r>
+          </w:p>
+        </w:tc>
+        <w:tc>
+          <w:tcPr>
+            <w:tcW w:type="dxa" w:w="5100"/>
+            <w:shd w:fill="F3FBF6" w:val="clear"/>
+          </w:tcPr>
+          <w:p>
+            <w:pPr>
+              <w:spacing w:after="40" w:before="40"/>
+            </w:pPr>
+            <w:r/>
+            <w:r>
+              <w:rPr>
+                <w:rFonts w:ascii="Calibri" w:hAnsi="Calibri"/>
+                <w:b w:val="0"/>
+                <w:color w:val="008C45"/>
+                <w:sz w:val="28"/>
+              </w:rPr>
+              <w:t>☐</w:t>
+            </w:r>
+            <w:r>
+              <w:rPr>
+                <w:rFonts w:ascii="Calibri" w:hAnsi="Calibri"/>
+                <w:b w:val="0"/>
+                <w:sz w:val="22"/>
+              </w:rPr>
+              <w:t xml:space="preserve">  </w:t>
+            </w:r>
+            <w:r>
+              <w:rPr>
+                <w:rFonts w:ascii="Calibri" w:hAnsi="Calibri"/>
+                <w:b w:val="0"/>
+                <w:color w:val="1C2B2A"/>
+                <w:sz w:val="21"/>
+              </w:rPr>
+              <w:t>Community outreach</w:t>
+            </w:r>
+          </w:p>
+        </w:tc>
+      </w:tr>
+      <w:tr>
+        <w:tc>
+          <w:tcPr>
+            <w:tcW w:type="dxa" w:w="5100"/>
+            <w:shd w:fill="F3FBF6" w:val="clear"/>
+          </w:tcPr>
+          <w:p>
+            <w:pPr>
+              <w:spacing w:after="40" w:before="40"/>
+            </w:pPr>
+            <w:r/>
+            <w:r>
+              <w:rPr>
+                <w:rFonts w:ascii="Calibri" w:hAnsi="Calibri"/>
+                <w:b w:val="0"/>
+                <w:color w:val="008C45"/>
+                <w:sz w:val="28"/>
+              </w:rPr>
+              <w:t>☐</w:t>
+            </w:r>
+            <w:r>
+              <w:rPr>
+                <w:rFonts w:ascii="Calibri" w:hAnsi="Calibri"/>
+                <w:b w:val="0"/>
+                <w:sz w:val="22"/>
+              </w:rPr>
+              <w:t xml:space="preserve">  </w:t>
+            </w:r>
+            <w:r>
+              <w:rPr>
+                <w:rFonts w:ascii="Calibri" w:hAnsi="Calibri"/>
+                <w:b w:val="0"/>
+                <w:color w:val="1C2B2A"/>
+                <w:sz w:val="21"/>
+              </w:rPr>
+              <w:t>Health education</w:t>
+            </w:r>
+          </w:p>
+        </w:tc>
+        <w:tc>
+          <w:tcPr>
+            <w:tcW w:type="dxa" w:w="5100"/>
+            <w:shd w:fill="F3FBF6" w:val="clear"/>
+          </w:tcPr>
+          <w:p>
+            <w:pPr>
+              <w:spacing w:after="40" w:before="40"/>
+            </w:pPr>
+            <w:r/>
+            <w:r>
+              <w:rPr>
+                <w:rFonts w:ascii="Calibri" w:hAnsi="Calibri"/>
+                <w:b w:val="0"/>
+                <w:color w:val="008C45"/>
+                <w:sz w:val="28"/>
+              </w:rPr>
+              <w:t>☐</w:t>
+            </w:r>
+            <w:r>
+              <w:rPr>
+                <w:rFonts w:ascii="Calibri" w:hAnsi="Calibri"/>
+                <w:b w:val="0"/>
+                <w:sz w:val="22"/>
+              </w:rPr>
+              <w:t xml:space="preserve">  </w:t>
+            </w:r>
+            <w:r>
+              <w:rPr>
+                <w:rFonts w:ascii="Calibri" w:hAnsi="Calibri"/>
+                <w:b w:val="0"/>
+                <w:color w:val="1C2B2A"/>
+                <w:sz w:val="21"/>
+              </w:rPr>
+              <w:t>Programme planning</w:t>
+            </w:r>
+          </w:p>
+        </w:tc>
+      </w:tr>
+      <w:tr>
+        <w:tc>
+          <w:tcPr>
+            <w:tcW w:type="dxa" w:w="5100"/>
+            <w:shd w:fill="F3FBF6" w:val="clear"/>
+          </w:tcPr>
+          <w:p>
+            <w:pPr>
+              <w:spacing w:after="40" w:before="40"/>
+            </w:pPr>
+            <w:r/>
+            <w:r>
+              <w:rPr>
+                <w:rFonts w:ascii="Calibri" w:hAnsi="Calibri"/>
+                <w:b w:val="0"/>
+                <w:color w:val="008C45"/>
+                <w:sz w:val="28"/>
+              </w:rPr>
+              <w:t>☐</w:t>
+            </w:r>
+            <w:r>
+              <w:rPr>
+                <w:rFonts w:ascii="Calibri" w:hAnsi="Calibri"/>
+                <w:b w:val="0"/>
+                <w:sz w:val="22"/>
+              </w:rPr>
+              <w:t xml:space="preserve">  </w:t>
+            </w:r>
+            <w:r>
+              <w:rPr>
+                <w:rFonts w:ascii="Calibri" w:hAnsi="Calibri"/>
+                <w:b w:val="0"/>
+                <w:color w:val="1C2B2A"/>
+                <w:sz w:val="21"/>
+              </w:rPr>
+              <w:t>Other</w:t>
+            </w:r>
+          </w:p>
+        </w:tc>
+        <w:tc>
+          <w:tcPr>
+            <w:tcW w:type="dxa" w:w="5100"/>
+          </w:tcPr>
+          <w:p>
+            <w:pPr>
+              <w:spacing w:after="40" w:before="40"/>
+            </w:pPr>
+            <w:r/>
+          </w:p>
+        </w:tc>
+      </w:tr>
+    </w:tbl>
+    <w:p/>
     <w:p>
       <w:pPr>
         <w:spacing w:after="80"/>

</xml_diff>

<commit_message>
Enhance layout and content of cardiology camp evaluation documents
- Updated `build_cardiology_camp_questionnaires.py` to improve the layout of the heading block, ensuring vertical alignment of logo and metadata.
- Revised PDF and Word evaluation forms to enhance clarity and consistency, including updated contact information and improved formatting.
- Adjusted spacing and alignment in internal staff and consultant evaluation documents to reinforce usability and presentation.
- Ensured all documents reflect FairBanks' commitment to effective feedback collection and community engagement.
</commit_message>
<xml_diff>
--- a/questionnaires/consultant_sho_evaluation.docx
+++ b/questionnaires/consultant_sho_evaluation.docx
@@ -2,62 +2,146 @@
 <file path=word/document.xml><?xml version="1.0" encoding="utf-8"?>
 <w:document xmlns:wpc="http://schemas.microsoft.com/office/word/2010/wordprocessingCanvas" xmlns:mo="http://schemas.microsoft.com/office/mac/office/2008/main" xmlns:mc="http://schemas.openxmlformats.org/markup-compatibility/2006" xmlns:mv="urn:schemas-microsoft-com:mac:vml" xmlns:o="urn:schemas-microsoft-com:office:office" xmlns:r="http://schemas.openxmlformats.org/officeDocument/2006/relationships" xmlns:m="http://schemas.openxmlformats.org/officeDocument/2006/math" xmlns:v="urn:schemas-microsoft-com:vml" xmlns:wp14="http://schemas.microsoft.com/office/word/2010/wordprocessingDrawing" xmlns:wp="http://schemas.openxmlformats.org/drawingml/2006/wordprocessingDrawing" xmlns:w10="urn:schemas-microsoft-com:office:word" xmlns:w="http://schemas.openxmlformats.org/wordprocessingml/2006/main" xmlns:w14="http://schemas.microsoft.com/office/word/2010/wordml" xmlns:wpg="http://schemas.microsoft.com/office/word/2010/wordprocessingGroup" xmlns:wpi="http://schemas.microsoft.com/office/word/2010/wordprocessingInk" xmlns:wne="http://schemas.microsoft.com/office/word/2006/wordml" xmlns:wps="http://schemas.microsoft.com/office/word/2010/wordprocessingShape" mc:Ignorable="w14 wp14">
   <w:body>
+    <w:tbl>
+      <w:tblPr>
+        <w:tblW w:type="auto" w:w="0"/>
+        <w:tblLayout w:type="autofit"/>
+        <w:tblLook w:firstColumn="1" w:firstRow="1" w:lastColumn="0" w:lastRow="0" w:noHBand="0" w:noVBand="1" w:val="04A0"/>
+      </w:tblPr>
+      <w:tblGrid>
+        <w:gridCol w:w="5100"/>
+        <w:gridCol w:w="5100"/>
+      </w:tblGrid>
+      <w:tr>
+        <w:tc>
+          <w:tcPr>
+            <w:tcW w:type="dxa" w:w="5100"/>
+            <w:vAlign w:val="center"/>
+          </w:tcPr>
+          <w:p>
+            <w:pPr>
+              <w:spacing w:before="0" w:after="0"/>
+              <w:jc w:val="left"/>
+            </w:pPr>
+            <w:r/>
+            <w:r>
+              <w:drawing>
+                <wp:inline xmlns:a="http://schemas.openxmlformats.org/drawingml/2006/main" xmlns:pic="http://schemas.openxmlformats.org/drawingml/2006/picture">
+                  <wp:extent cx="1965960" cy="738149"/>
+                  <wp:docPr id="1" name="Picture 1"/>
+                  <wp:cNvGraphicFramePr>
+                    <a:graphicFrameLocks noChangeAspect="1"/>
+                  </wp:cNvGraphicFramePr>
+                  <a:graphic>
+                    <a:graphicData uri="http://schemas.openxmlformats.org/drawingml/2006/picture">
+                      <pic:pic>
+                        <pic:nvPicPr>
+                          <pic:cNvPr id="0" name="fairbanks_logo.jpeg"/>
+                          <pic:cNvPicPr/>
+                        </pic:nvPicPr>
+                        <pic:blipFill>
+                          <a:blip r:embed="rId9"/>
+                          <a:stretch>
+                            <a:fillRect/>
+                          </a:stretch>
+                        </pic:blipFill>
+                        <pic:spPr>
+                          <a:xfrm>
+                            <a:off x="0" y="0"/>
+                            <a:ext cx="1965960" cy="738149"/>
+                          </a:xfrm>
+                          <a:prstGeom prst="rect"/>
+                        </pic:spPr>
+                      </pic:pic>
+                    </a:graphicData>
+                  </a:graphic>
+                </wp:inline>
+              </w:drawing>
+            </w:r>
+          </w:p>
+        </w:tc>
+        <w:tc>
+          <w:tcPr>
+            <w:tcW w:type="dxa" w:w="5100"/>
+            <w:vAlign w:val="center"/>
+          </w:tcPr>
+          <w:p>
+            <w:pPr>
+              <w:spacing w:after="20" w:before="0"/>
+            </w:pPr>
+            <w:r/>
+            <w:r>
+              <w:rPr>
+                <w:rFonts w:ascii="Calibri" w:hAnsi="Calibri"/>
+                <w:b/>
+                <w:color w:val="1C2B2A"/>
+                <w:sz w:val="24"/>
+              </w:rPr>
+              <w:t>Community Cardiology Camp</w:t>
+            </w:r>
+          </w:p>
+          <w:p>
+            <w:pPr>
+              <w:spacing w:after="20" w:before="0"/>
+            </w:pPr>
+            <w:r>
+              <w:rPr>
+                <w:rFonts w:ascii="Calibri" w:hAnsi="Calibri"/>
+                <w:b w:val="0"/>
+                <w:color w:val="008C45"/>
+                <w:sz w:val="18"/>
+              </w:rPr>
+              <w:t>Your health, our mission.</w:t>
+            </w:r>
+          </w:p>
+          <w:p>
+            <w:pPr>
+              <w:spacing w:after="20" w:before="0"/>
+            </w:pPr>
+            <w:r>
+              <w:rPr>
+                <w:rFonts w:ascii="Calibri" w:hAnsi="Calibri"/>
+                <w:b w:val="0"/>
+                <w:color w:val="5A6A6A"/>
+                <w:sz w:val="17"/>
+              </w:rPr>
+              <w:t>Tel: 0701 849258  |  WhatsApp: 0777 462398</w:t>
+            </w:r>
+          </w:p>
+          <w:p>
+            <w:pPr>
+              <w:spacing w:after="20" w:before="0"/>
+            </w:pPr>
+            <w:r>
+              <w:rPr>
+                <w:rFonts w:ascii="Calibri" w:hAnsi="Calibri"/>
+                <w:b w:val="0"/>
+                <w:color w:val="5A6A6A"/>
+                <w:sz w:val="17"/>
+              </w:rPr>
+              <w:t>Email: info@fairbanksmedicalcentre.org  |  Web: www.fairbanksmedicalcentre.ug</w:t>
+            </w:r>
+          </w:p>
+          <w:p>
+            <w:pPr>
+              <w:spacing w:after="20" w:before="0"/>
+            </w:pPr>
+            <w:r>
+              <w:rPr>
+                <w:rFonts w:ascii="Calibri" w:hAnsi="Calibri"/>
+                <w:b w:val="0"/>
+                <w:color w:val="5A6A6A"/>
+                <w:sz w:val="16"/>
+              </w:rPr>
+              <w:t>Tirupati Road, Kyebando-Kisalosalo (Opp. Northern Bypass Roundabout), Kampala</w:t>
+            </w:r>
+          </w:p>
+        </w:tc>
+      </w:tr>
+    </w:tbl>
     <w:p>
       <w:pPr>
-        <w:spacing w:after="80"/>
-        <w:jc w:val="center"/>
-      </w:pPr>
-      <w:r>
-        <w:drawing>
-          <wp:inline xmlns:a="http://schemas.openxmlformats.org/drawingml/2006/main" xmlns:pic="http://schemas.openxmlformats.org/drawingml/2006/picture">
-            <wp:extent cx="2286000" cy="858312"/>
-            <wp:docPr id="1" name="Picture 1"/>
-            <wp:cNvGraphicFramePr>
-              <a:graphicFrameLocks noChangeAspect="1"/>
-            </wp:cNvGraphicFramePr>
-            <a:graphic>
-              <a:graphicData uri="http://schemas.openxmlformats.org/drawingml/2006/picture">
-                <pic:pic>
-                  <pic:nvPicPr>
-                    <pic:cNvPr id="0" name="fairbanks_logo.jpeg"/>
-                    <pic:cNvPicPr/>
-                  </pic:nvPicPr>
-                  <pic:blipFill>
-                    <a:blip r:embed="rId9"/>
-                    <a:stretch>
-                      <a:fillRect/>
-                    </a:stretch>
-                  </pic:blipFill>
-                  <pic:spPr>
-                    <a:xfrm>
-                      <a:off x="0" y="0"/>
-                      <a:ext cx="2286000" cy="858312"/>
-                    </a:xfrm>
-                    <a:prstGeom prst="rect"/>
-                  </pic:spPr>
-                </pic:pic>
-              </a:graphicData>
-            </a:graphic>
-          </wp:inline>
-        </w:drawing>
-      </w:r>
-    </w:p>
-    <w:p>
-      <w:pPr>
-        <w:jc w:val="center"/>
-      </w:pPr>
-      <w:r>
-        <w:rPr>
-          <w:rFonts w:ascii="Calibri" w:hAnsi="Calibri"/>
-          <w:b/>
-          <w:color w:val="1C2B2A"/>
-          <w:sz w:val="26"/>
-        </w:rPr>
-        <w:t>Community Cardiology Camp</w:t>
-      </w:r>
-    </w:p>
-    <w:p>
-      <w:pPr>
+        <w:spacing w:before="200"/>
         <w:jc w:val="center"/>
       </w:pPr>
       <w:r>
@@ -82,65 +166,6 @@
           <w:sz w:val="20"/>
         </w:rPr>
         <w:t>FairBanks Reach Programme  ·  Confidential feedback  ·  ~10–12 minutes</w:t>
-      </w:r>
-    </w:p>
-    <w:p>
-      <w:pPr>
-        <w:jc w:val="center"/>
-      </w:pPr>
-      <w:r>
-        <w:rPr>
-          <w:rFonts w:ascii="Calibri" w:hAnsi="Calibri"/>
-          <w:b w:val="0"/>
-          <w:color w:val="008C45"/>
-          <w:sz w:val="18"/>
-        </w:rPr>
-        <w:t>Your health, our mission.</w:t>
-      </w:r>
-    </w:p>
-    <w:p>
-      <w:pPr>
-        <w:spacing w:after="0" w:before="0"/>
-        <w:jc w:val="center"/>
-      </w:pPr>
-      <w:r>
-        <w:rPr>
-          <w:rFonts w:ascii="Calibri" w:hAnsi="Calibri"/>
-          <w:b w:val="0"/>
-          <w:color w:val="5A6A6A"/>
-          <w:sz w:val="17"/>
-        </w:rPr>
-        <w:t>Tirupati Road, Kyebando-Kisalosalo (Opp. Northern Bypass Roundabout), Kampala</w:t>
-      </w:r>
-    </w:p>
-    <w:p>
-      <w:pPr>
-        <w:spacing w:after="0" w:before="0"/>
-        <w:jc w:val="center"/>
-      </w:pPr>
-      <w:r>
-        <w:rPr>
-          <w:rFonts w:ascii="Calibri" w:hAnsi="Calibri"/>
-          <w:b w:val="0"/>
-          <w:color w:val="5A6A6A"/>
-          <w:sz w:val="17"/>
-        </w:rPr>
-        <w:t>Tel: 0701 849258  |  WhatsApp: 0777 462398</w:t>
-      </w:r>
-    </w:p>
-    <w:p>
-      <w:pPr>
-        <w:spacing w:after="0" w:before="0"/>
-        <w:jc w:val="center"/>
-      </w:pPr>
-      <w:r>
-        <w:rPr>
-          <w:rFonts w:ascii="Calibri" w:hAnsi="Calibri"/>
-          <w:b w:val="0"/>
-          <w:color w:val="5A6A6A"/>
-          <w:sz w:val="17"/>
-        </w:rPr>
-        <w:t>Email: info@fairbanksmedicalcentre.org  |  Web: www.fairbanksmedicalcentre.ug</w:t>
       </w:r>
     </w:p>
     <w:p/>

</xml_diff>